<commit_message>
aula 2 no site da Barbearia
</commit_message>
<xml_diff>
--- a/apostila/Apostila Space For Men.docx
+++ b/apostila/Apostila Space For Men.docx
@@ -86,8 +86,6 @@
         </w:rPr>
         <w:t xml:space="preserve">    </w:t>
       </w:r>
-      <w:bookmarkStart w:id="0" w:name="_GoBack"/>
-      <w:bookmarkEnd w:id="0"/>
       <w:r>
         <w:rPr>
           <w:sz w:val="24"/>
@@ -465,6 +463,1167 @@
           </wp:inline>
         </w:drawing>
       </w:r>
+    </w:p>
+    <w:p>
+      <w:pPr>
+        <w:pStyle w:val="PargrafodaLista"/>
+        <w:tabs>
+          <w:tab w:val="left" w:pos="1275"/>
+        </w:tabs>
+        <w:rPr>
+          <w:sz w:val="24"/>
+          <w:szCs w:val="24"/>
+        </w:rPr>
+      </w:pPr>
+    </w:p>
+    <w:p>
+      <w:pPr>
+        <w:pStyle w:val="PargrafodaLista"/>
+        <w:tabs>
+          <w:tab w:val="left" w:pos="1275"/>
+        </w:tabs>
+        <w:rPr>
+          <w:sz w:val="24"/>
+          <w:szCs w:val="24"/>
+        </w:rPr>
+      </w:pPr>
+      <w:r>
+        <w:rPr>
+          <w:sz w:val="24"/>
+          <w:szCs w:val="24"/>
+        </w:rPr>
+        <w:t xml:space="preserve">2 </w:t>
+      </w:r>
+      <w:r>
+        <w:rPr>
+          <w:sz w:val="24"/>
+          <w:szCs w:val="24"/>
+        </w:rPr>
+        <w:t>–</w:t>
+      </w:r>
+      <w:r>
+        <w:rPr>
+          <w:sz w:val="24"/>
+          <w:szCs w:val="24"/>
+        </w:rPr>
+        <w:t xml:space="preserve"> </w:t>
+      </w:r>
+      <w:r>
+        <w:rPr>
+          <w:sz w:val="24"/>
+          <w:szCs w:val="24"/>
+        </w:rPr>
+        <w:t xml:space="preserve">Criamos dois arquivos index.htm e style.css </w:t>
+      </w:r>
+      <w:r>
+        <w:rPr>
+          <w:sz w:val="24"/>
+          <w:szCs w:val="24"/>
+        </w:rPr>
+        <w:t>para estrutura e trabalhar com nossa página web.</w:t>
+      </w:r>
+    </w:p>
+    <w:p>
+      <w:pPr>
+        <w:pStyle w:val="PargrafodaLista"/>
+        <w:tabs>
+          <w:tab w:val="left" w:pos="1275"/>
+        </w:tabs>
+        <w:rPr>
+          <w:sz w:val="24"/>
+          <w:szCs w:val="24"/>
+        </w:rPr>
+      </w:pPr>
+      <w:r>
+        <w:rPr>
+          <w:sz w:val="24"/>
+          <w:szCs w:val="24"/>
+        </w:rPr>
+        <w:drawing>
+          <wp:inline distT="0" distB="0" distL="0" distR="0" wp14:anchorId="60B1FF74" wp14:editId="0B77CC61">
+            <wp:extent cx="2838846" cy="2972215"/>
+            <wp:effectExtent l="0" t="0" r="0" b="0"/>
+            <wp:docPr id="4" name="Imagem 4"/>
+            <wp:cNvGraphicFramePr>
+              <a:graphicFrameLocks xmlns:a="http://schemas.openxmlformats.org/drawingml/2006/main" noChangeAspect="1"/>
+            </wp:cNvGraphicFramePr>
+            <a:graphic xmlns:a="http://schemas.openxmlformats.org/drawingml/2006/main">
+              <a:graphicData uri="http://schemas.openxmlformats.org/drawingml/2006/picture">
+                <pic:pic xmlns:pic="http://schemas.openxmlformats.org/drawingml/2006/picture">
+                  <pic:nvPicPr>
+                    <pic:cNvPr id="1" name=""/>
+                    <pic:cNvPicPr/>
+                  </pic:nvPicPr>
+                  <pic:blipFill>
+                    <a:blip r:embed="rId8"/>
+                    <a:stretch>
+                      <a:fillRect/>
+                    </a:stretch>
+                  </pic:blipFill>
+                  <pic:spPr>
+                    <a:xfrm>
+                      <a:off x="0" y="0"/>
+                      <a:ext cx="2838846" cy="2972215"/>
+                    </a:xfrm>
+                    <a:prstGeom prst="rect">
+                      <a:avLst/>
+                    </a:prstGeom>
+                  </pic:spPr>
+                </pic:pic>
+              </a:graphicData>
+            </a:graphic>
+          </wp:inline>
+        </w:drawing>
+      </w:r>
+    </w:p>
+    <w:p>
+      <w:pPr>
+        <w:pStyle w:val="PargrafodaLista"/>
+        <w:tabs>
+          <w:tab w:val="left" w:pos="1275"/>
+        </w:tabs>
+        <w:rPr>
+          <w:sz w:val="24"/>
+          <w:szCs w:val="24"/>
+        </w:rPr>
+      </w:pPr>
+    </w:p>
+    <w:p>
+      <w:pPr>
+        <w:pStyle w:val="PargrafodaLista"/>
+        <w:tabs>
+          <w:tab w:val="left" w:pos="1275"/>
+        </w:tabs>
+        <w:rPr>
+          <w:sz w:val="24"/>
+          <w:szCs w:val="24"/>
+        </w:rPr>
+      </w:pPr>
+      <w:r>
+        <w:rPr>
+          <w:sz w:val="24"/>
+          <w:szCs w:val="24"/>
+        </w:rPr>
+        <w:t xml:space="preserve">3 </w:t>
+      </w:r>
+      <w:r>
+        <w:rPr>
+          <w:sz w:val="24"/>
+          <w:szCs w:val="24"/>
+        </w:rPr>
+        <w:t>–</w:t>
+      </w:r>
+      <w:r>
+        <w:rPr>
+          <w:sz w:val="24"/>
+          <w:szCs w:val="24"/>
+        </w:rPr>
+        <w:t xml:space="preserve"> </w:t>
+      </w:r>
+      <w:r>
+        <w:rPr>
+          <w:sz w:val="24"/>
+          <w:szCs w:val="24"/>
+        </w:rPr>
+        <w:t xml:space="preserve">No Style.css utilizamos o </w:t>
+      </w:r>
+      <w:proofErr w:type="spellStart"/>
+      <w:r>
+        <w:rPr>
+          <w:sz w:val="24"/>
+          <w:szCs w:val="24"/>
+        </w:rPr>
+        <w:t>css</w:t>
+      </w:r>
+      <w:proofErr w:type="spellEnd"/>
+      <w:r>
+        <w:rPr>
+          <w:sz w:val="24"/>
+          <w:szCs w:val="24"/>
+        </w:rPr>
+        <w:t xml:space="preserve"> por referencia e utilizamos a regra </w:t>
+      </w:r>
+      <w:r>
+        <w:rPr>
+          <w:sz w:val="24"/>
+          <w:szCs w:val="24"/>
+        </w:rPr>
+        <w:t xml:space="preserve">da </w:t>
+      </w:r>
+      <w:proofErr w:type="spellStart"/>
+      <w:r>
+        <w:rPr>
+          <w:sz w:val="24"/>
+          <w:szCs w:val="24"/>
+        </w:rPr>
+        <w:t>tags</w:t>
+      </w:r>
+      <w:proofErr w:type="spellEnd"/>
+      <w:r>
+        <w:rPr>
+          <w:sz w:val="24"/>
+          <w:szCs w:val="24"/>
+        </w:rPr>
+        <w:t xml:space="preserve"> alinhada que a primeira que abre a ultima que fecha conforme imagem</w:t>
+      </w:r>
+    </w:p>
+    <w:p>
+      <w:pPr>
+        <w:pStyle w:val="PargrafodaLista"/>
+        <w:tabs>
+          <w:tab w:val="left" w:pos="1275"/>
+        </w:tabs>
+        <w:rPr>
+          <w:sz w:val="24"/>
+          <w:szCs w:val="24"/>
+        </w:rPr>
+      </w:pPr>
+      <w:r>
+        <w:rPr>
+          <w:sz w:val="24"/>
+          <w:szCs w:val="24"/>
+        </w:rPr>
+        <w:drawing>
+          <wp:inline distT="0" distB="0" distL="0" distR="0" wp14:anchorId="2661ABB7" wp14:editId="4346CC68">
+            <wp:extent cx="8221917" cy="282432"/>
+            <wp:effectExtent l="0" t="0" r="0" b="3810"/>
+            <wp:docPr id="5" name="Imagem 5"/>
+            <wp:cNvGraphicFramePr>
+              <a:graphicFrameLocks xmlns:a="http://schemas.openxmlformats.org/drawingml/2006/main" noChangeAspect="1"/>
+            </wp:cNvGraphicFramePr>
+            <a:graphic xmlns:a="http://schemas.openxmlformats.org/drawingml/2006/main">
+              <a:graphicData uri="http://schemas.openxmlformats.org/drawingml/2006/picture">
+                <pic:pic xmlns:pic="http://schemas.openxmlformats.org/drawingml/2006/picture">
+                  <pic:nvPicPr>
+                    <pic:cNvPr id="1" name=""/>
+                    <pic:cNvPicPr/>
+                  </pic:nvPicPr>
+                  <pic:blipFill>
+                    <a:blip r:embed="rId9"/>
+                    <a:stretch>
+                      <a:fillRect/>
+                    </a:stretch>
+                  </pic:blipFill>
+                  <pic:spPr>
+                    <a:xfrm>
+                      <a:off x="0" y="0"/>
+                      <a:ext cx="9022733" cy="309941"/>
+                    </a:xfrm>
+                    <a:prstGeom prst="rect">
+                      <a:avLst/>
+                    </a:prstGeom>
+                  </pic:spPr>
+                </pic:pic>
+              </a:graphicData>
+            </a:graphic>
+          </wp:inline>
+        </w:drawing>
+      </w:r>
+    </w:p>
+    <w:p>
+      <w:pPr>
+        <w:pStyle w:val="PargrafodaLista"/>
+        <w:tabs>
+          <w:tab w:val="left" w:pos="1275"/>
+        </w:tabs>
+        <w:rPr>
+          <w:sz w:val="24"/>
+          <w:szCs w:val="24"/>
+        </w:rPr>
+      </w:pPr>
+      <w:r>
+        <w:rPr>
+          <w:sz w:val="24"/>
+          <w:szCs w:val="24"/>
+        </w:rPr>
+        <w:drawing>
+          <wp:inline distT="0" distB="0" distL="0" distR="0" wp14:anchorId="5F85F320" wp14:editId="41E01429">
+            <wp:extent cx="2553056" cy="1238423"/>
+            <wp:effectExtent l="0" t="0" r="0" b="0"/>
+            <wp:docPr id="6" name="Imagem 6"/>
+            <wp:cNvGraphicFramePr>
+              <a:graphicFrameLocks xmlns:a="http://schemas.openxmlformats.org/drawingml/2006/main" noChangeAspect="1"/>
+            </wp:cNvGraphicFramePr>
+            <a:graphic xmlns:a="http://schemas.openxmlformats.org/drawingml/2006/main">
+              <a:graphicData uri="http://schemas.openxmlformats.org/drawingml/2006/picture">
+                <pic:pic xmlns:pic="http://schemas.openxmlformats.org/drawingml/2006/picture">
+                  <pic:nvPicPr>
+                    <pic:cNvPr id="1" name=""/>
+                    <pic:cNvPicPr/>
+                  </pic:nvPicPr>
+                  <pic:blipFill>
+                    <a:blip r:embed="rId10"/>
+                    <a:stretch>
+                      <a:fillRect/>
+                    </a:stretch>
+                  </pic:blipFill>
+                  <pic:spPr>
+                    <a:xfrm>
+                      <a:off x="0" y="0"/>
+                      <a:ext cx="2553056" cy="1238423"/>
+                    </a:xfrm>
+                    <a:prstGeom prst="rect">
+                      <a:avLst/>
+                    </a:prstGeom>
+                  </pic:spPr>
+                </pic:pic>
+              </a:graphicData>
+            </a:graphic>
+          </wp:inline>
+        </w:drawing>
+      </w:r>
+    </w:p>
+    <w:p>
+      <w:pPr>
+        <w:pStyle w:val="PargrafodaLista"/>
+        <w:tabs>
+          <w:tab w:val="left" w:pos="1275"/>
+        </w:tabs>
+        <w:rPr>
+          <w:sz w:val="24"/>
+          <w:szCs w:val="24"/>
+        </w:rPr>
+      </w:pPr>
+    </w:p>
+    <w:p>
+      <w:pPr>
+        <w:pStyle w:val="PargrafodaLista"/>
+        <w:tabs>
+          <w:tab w:val="left" w:pos="1275"/>
+        </w:tabs>
+        <w:rPr>
+          <w:sz w:val="24"/>
+          <w:szCs w:val="24"/>
+        </w:rPr>
+      </w:pPr>
+      <w:r>
+        <w:rPr>
+          <w:sz w:val="24"/>
+          <w:szCs w:val="24"/>
+        </w:rPr>
+        <w:t>4- Adicionamos a imagem banner ao nosso site utilizando o seguinte comando:</w:t>
+      </w:r>
+      <w:r>
+        <w:rPr>
+          <w:sz w:val="24"/>
+          <w:szCs w:val="24"/>
+        </w:rPr>
+        <w:br/>
+      </w:r>
+      <w:r>
+        <w:rPr>
+          <w:sz w:val="24"/>
+          <w:szCs w:val="24"/>
+        </w:rPr>
+        <w:drawing>
+          <wp:inline distT="0" distB="0" distL="0" distR="0" wp14:anchorId="4F334D67" wp14:editId="27D840B9">
+            <wp:extent cx="5182323" cy="685896"/>
+            <wp:effectExtent l="0" t="0" r="0" b="0"/>
+            <wp:docPr id="7" name="Imagem 7"/>
+            <wp:cNvGraphicFramePr>
+              <a:graphicFrameLocks xmlns:a="http://schemas.openxmlformats.org/drawingml/2006/main" noChangeAspect="1"/>
+            </wp:cNvGraphicFramePr>
+            <a:graphic xmlns:a="http://schemas.openxmlformats.org/drawingml/2006/main">
+              <a:graphicData uri="http://schemas.openxmlformats.org/drawingml/2006/picture">
+                <pic:pic xmlns:pic="http://schemas.openxmlformats.org/drawingml/2006/picture">
+                  <pic:nvPicPr>
+                    <pic:cNvPr id="1" name=""/>
+                    <pic:cNvPicPr/>
+                  </pic:nvPicPr>
+                  <pic:blipFill>
+                    <a:blip r:embed="rId11"/>
+                    <a:stretch>
+                      <a:fillRect/>
+                    </a:stretch>
+                  </pic:blipFill>
+                  <pic:spPr>
+                    <a:xfrm>
+                      <a:off x="0" y="0"/>
+                      <a:ext cx="5182323" cy="685896"/>
+                    </a:xfrm>
+                    <a:prstGeom prst="rect">
+                      <a:avLst/>
+                    </a:prstGeom>
+                  </pic:spPr>
+                </pic:pic>
+              </a:graphicData>
+            </a:graphic>
+          </wp:inline>
+        </w:drawing>
+      </w:r>
+    </w:p>
+    <w:p>
+      <w:pPr>
+        <w:pStyle w:val="PargrafodaLista"/>
+        <w:tabs>
+          <w:tab w:val="left" w:pos="1275"/>
+        </w:tabs>
+        <w:rPr>
+          <w:sz w:val="24"/>
+          <w:szCs w:val="24"/>
+        </w:rPr>
+      </w:pPr>
+    </w:p>
+    <w:p>
+      <w:pPr>
+        <w:pStyle w:val="PargrafodaLista"/>
+        <w:tabs>
+          <w:tab w:val="left" w:pos="1275"/>
+        </w:tabs>
+        <w:rPr>
+          <w:sz w:val="24"/>
+          <w:szCs w:val="24"/>
+        </w:rPr>
+      </w:pPr>
+    </w:p>
+    <w:p>
+      <w:pPr>
+        <w:pStyle w:val="PargrafodaLista"/>
+        <w:tabs>
+          <w:tab w:val="left" w:pos="1275"/>
+        </w:tabs>
+        <w:rPr>
+          <w:sz w:val="24"/>
+          <w:szCs w:val="24"/>
+        </w:rPr>
+      </w:pPr>
+      <w:r>
+        <w:rPr>
+          <w:sz w:val="24"/>
+          <w:szCs w:val="24"/>
+        </w:rPr>
+        <w:t xml:space="preserve">5- </w:t>
+      </w:r>
+      <w:r>
+        <w:rPr>
+          <w:sz w:val="24"/>
+          <w:szCs w:val="24"/>
+        </w:rPr>
+        <w:t>Inserimos um id na imagem para que ela ocupe 100% de largura da nossa página.</w:t>
+      </w:r>
+    </w:p>
+    <w:p>
+      <w:pPr>
+        <w:pStyle w:val="PargrafodaLista"/>
+        <w:tabs>
+          <w:tab w:val="left" w:pos="1275"/>
+        </w:tabs>
+        <w:rPr>
+          <w:sz w:val="24"/>
+          <w:szCs w:val="24"/>
+        </w:rPr>
+      </w:pPr>
+    </w:p>
+    <w:p>
+      <w:pPr>
+        <w:pStyle w:val="PargrafodaLista"/>
+        <w:tabs>
+          <w:tab w:val="left" w:pos="1275"/>
+        </w:tabs>
+        <w:rPr>
+          <w:sz w:val="24"/>
+          <w:szCs w:val="24"/>
+        </w:rPr>
+      </w:pPr>
+      <w:r>
+        <w:rPr>
+          <w:sz w:val="24"/>
+          <w:szCs w:val="24"/>
+        </w:rPr>
+        <w:drawing>
+          <wp:inline distT="0" distB="0" distL="0" distR="0" wp14:anchorId="7AAB3373" wp14:editId="352FBB47">
+            <wp:extent cx="5811061" cy="514422"/>
+            <wp:effectExtent l="0" t="0" r="0" b="0"/>
+            <wp:docPr id="8" name="Imagem 8"/>
+            <wp:cNvGraphicFramePr>
+              <a:graphicFrameLocks xmlns:a="http://schemas.openxmlformats.org/drawingml/2006/main" noChangeAspect="1"/>
+            </wp:cNvGraphicFramePr>
+            <a:graphic xmlns:a="http://schemas.openxmlformats.org/drawingml/2006/main">
+              <a:graphicData uri="http://schemas.openxmlformats.org/drawingml/2006/picture">
+                <pic:pic xmlns:pic="http://schemas.openxmlformats.org/drawingml/2006/picture">
+                  <pic:nvPicPr>
+                    <pic:cNvPr id="1" name=""/>
+                    <pic:cNvPicPr/>
+                  </pic:nvPicPr>
+                  <pic:blipFill>
+                    <a:blip r:embed="rId12"/>
+                    <a:stretch>
+                      <a:fillRect/>
+                    </a:stretch>
+                  </pic:blipFill>
+                  <pic:spPr>
+                    <a:xfrm>
+                      <a:off x="0" y="0"/>
+                      <a:ext cx="5811061" cy="514422"/>
+                    </a:xfrm>
+                    <a:prstGeom prst="rect">
+                      <a:avLst/>
+                    </a:prstGeom>
+                  </pic:spPr>
+                </pic:pic>
+              </a:graphicData>
+            </a:graphic>
+          </wp:inline>
+        </w:drawing>
+      </w:r>
+    </w:p>
+    <w:p>
+      <w:pPr>
+        <w:pStyle w:val="PargrafodaLista"/>
+        <w:tabs>
+          <w:tab w:val="left" w:pos="1275"/>
+        </w:tabs>
+        <w:rPr>
+          <w:sz w:val="24"/>
+          <w:szCs w:val="24"/>
+        </w:rPr>
+      </w:pPr>
+      <w:r>
+        <w:rPr>
+          <w:sz w:val="24"/>
+          <w:szCs w:val="24"/>
+        </w:rPr>
+        <w:drawing>
+          <wp:inline distT="0" distB="0" distL="0" distR="0" wp14:anchorId="6245F465" wp14:editId="0F4F8FEA">
+            <wp:extent cx="2648320" cy="1114581"/>
+            <wp:effectExtent l="0" t="0" r="0" b="9525"/>
+            <wp:docPr id="9" name="Imagem 9"/>
+            <wp:cNvGraphicFramePr>
+              <a:graphicFrameLocks xmlns:a="http://schemas.openxmlformats.org/drawingml/2006/main" noChangeAspect="1"/>
+            </wp:cNvGraphicFramePr>
+            <a:graphic xmlns:a="http://schemas.openxmlformats.org/drawingml/2006/main">
+              <a:graphicData uri="http://schemas.openxmlformats.org/drawingml/2006/picture">
+                <pic:pic xmlns:pic="http://schemas.openxmlformats.org/drawingml/2006/picture">
+                  <pic:nvPicPr>
+                    <pic:cNvPr id="1" name=""/>
+                    <pic:cNvPicPr/>
+                  </pic:nvPicPr>
+                  <pic:blipFill>
+                    <a:blip r:embed="rId13"/>
+                    <a:stretch>
+                      <a:fillRect/>
+                    </a:stretch>
+                  </pic:blipFill>
+                  <pic:spPr>
+                    <a:xfrm>
+                      <a:off x="0" y="0"/>
+                      <a:ext cx="2648320" cy="1114581"/>
+                    </a:xfrm>
+                    <a:prstGeom prst="rect">
+                      <a:avLst/>
+                    </a:prstGeom>
+                  </pic:spPr>
+                </pic:pic>
+              </a:graphicData>
+            </a:graphic>
+          </wp:inline>
+        </w:drawing>
+      </w:r>
+    </w:p>
+    <w:p>
+      <w:pPr>
+        <w:pStyle w:val="PargrafodaLista"/>
+        <w:tabs>
+          <w:tab w:val="left" w:pos="1275"/>
+        </w:tabs>
+        <w:rPr>
+          <w:sz w:val="24"/>
+          <w:szCs w:val="24"/>
+        </w:rPr>
+      </w:pPr>
+    </w:p>
+    <w:p>
+      <w:pPr>
+        <w:pStyle w:val="PargrafodaLista"/>
+        <w:tabs>
+          <w:tab w:val="left" w:pos="1275"/>
+        </w:tabs>
+        <w:rPr>
+          <w:sz w:val="24"/>
+          <w:szCs w:val="24"/>
+        </w:rPr>
+      </w:pPr>
+      <w:r>
+        <w:rPr>
+          <w:sz w:val="24"/>
+          <w:szCs w:val="24"/>
+        </w:rPr>
+        <w:t>6- Centralizamos o titulo principal da nossa página!</w:t>
+      </w:r>
+    </w:p>
+    <w:p>
+      <w:pPr>
+        <w:pStyle w:val="PargrafodaLista"/>
+        <w:tabs>
+          <w:tab w:val="left" w:pos="1275"/>
+        </w:tabs>
+        <w:rPr>
+          <w:sz w:val="24"/>
+          <w:szCs w:val="24"/>
+        </w:rPr>
+      </w:pPr>
+      <w:r>
+        <w:rPr>
+          <w:sz w:val="24"/>
+          <w:szCs w:val="24"/>
+        </w:rPr>
+        <w:drawing>
+          <wp:inline distT="0" distB="0" distL="0" distR="0" wp14:anchorId="002AADE6" wp14:editId="6D983927">
+            <wp:extent cx="2962688" cy="1114581"/>
+            <wp:effectExtent l="0" t="0" r="0" b="9525"/>
+            <wp:docPr id="10" name="Imagem 10"/>
+            <wp:cNvGraphicFramePr>
+              <a:graphicFrameLocks xmlns:a="http://schemas.openxmlformats.org/drawingml/2006/main" noChangeAspect="1"/>
+            </wp:cNvGraphicFramePr>
+            <a:graphic xmlns:a="http://schemas.openxmlformats.org/drawingml/2006/main">
+              <a:graphicData uri="http://schemas.openxmlformats.org/drawingml/2006/picture">
+                <pic:pic xmlns:pic="http://schemas.openxmlformats.org/drawingml/2006/picture">
+                  <pic:nvPicPr>
+                    <pic:cNvPr id="1" name=""/>
+                    <pic:cNvPicPr/>
+                  </pic:nvPicPr>
+                  <pic:blipFill>
+                    <a:blip r:embed="rId14"/>
+                    <a:stretch>
+                      <a:fillRect/>
+                    </a:stretch>
+                  </pic:blipFill>
+                  <pic:spPr>
+                    <a:xfrm>
+                      <a:off x="0" y="0"/>
+                      <a:ext cx="2962688" cy="1114581"/>
+                    </a:xfrm>
+                    <a:prstGeom prst="rect">
+                      <a:avLst/>
+                    </a:prstGeom>
+                  </pic:spPr>
+                </pic:pic>
+              </a:graphicData>
+            </a:graphic>
+          </wp:inline>
+        </w:drawing>
+      </w:r>
+    </w:p>
+    <w:p>
+      <w:pPr>
+        <w:pStyle w:val="PargrafodaLista"/>
+        <w:tabs>
+          <w:tab w:val="left" w:pos="1275"/>
+        </w:tabs>
+        <w:rPr>
+          <w:sz w:val="24"/>
+          <w:szCs w:val="24"/>
+        </w:rPr>
+      </w:pPr>
+    </w:p>
+    <w:p>
+      <w:pPr>
+        <w:pStyle w:val="PargrafodaLista"/>
+        <w:tabs>
+          <w:tab w:val="left" w:pos="1275"/>
+        </w:tabs>
+        <w:rPr>
+          <w:sz w:val="24"/>
+          <w:szCs w:val="24"/>
+        </w:rPr>
+      </w:pPr>
+      <w:r>
+        <w:rPr>
+          <w:sz w:val="24"/>
+          <w:szCs w:val="24"/>
+        </w:rPr>
+        <w:t xml:space="preserve">7- No paragrafo da Missão inserimos uma </w:t>
+      </w:r>
+      <w:proofErr w:type="spellStart"/>
+      <w:r>
+        <w:rPr>
+          <w:sz w:val="24"/>
+          <w:szCs w:val="24"/>
+        </w:rPr>
+        <w:t>class</w:t>
+      </w:r>
+      <w:proofErr w:type="spellEnd"/>
+      <w:r>
+        <w:rPr>
+          <w:sz w:val="24"/>
+          <w:szCs w:val="24"/>
+        </w:rPr>
+        <w:t xml:space="preserve"> </w:t>
+      </w:r>
+      <w:r>
+        <w:rPr>
+          <w:sz w:val="24"/>
+          <w:szCs w:val="24"/>
+        </w:rPr>
+        <w:t>e aumentamos o tamanho da fonte.</w:t>
+      </w:r>
+    </w:p>
+    <w:p>
+      <w:pPr>
+        <w:pStyle w:val="PargrafodaLista"/>
+        <w:tabs>
+          <w:tab w:val="left" w:pos="1275"/>
+        </w:tabs>
+        <w:rPr>
+          <w:sz w:val="24"/>
+          <w:szCs w:val="24"/>
+        </w:rPr>
+      </w:pPr>
+      <w:r>
+        <w:rPr>
+          <w:sz w:val="24"/>
+          <w:szCs w:val="24"/>
+        </w:rPr>
+        <w:drawing>
+          <wp:inline distT="0" distB="0" distL="0" distR="0" wp14:anchorId="6711401B" wp14:editId="534D4AB1">
+            <wp:extent cx="8058539" cy="444609"/>
+            <wp:effectExtent l="0" t="0" r="0" b="0"/>
+            <wp:docPr id="11" name="Imagem 11"/>
+            <wp:cNvGraphicFramePr>
+              <a:graphicFrameLocks xmlns:a="http://schemas.openxmlformats.org/drawingml/2006/main" noChangeAspect="1"/>
+            </wp:cNvGraphicFramePr>
+            <a:graphic xmlns:a="http://schemas.openxmlformats.org/drawingml/2006/main">
+              <a:graphicData uri="http://schemas.openxmlformats.org/drawingml/2006/picture">
+                <pic:pic xmlns:pic="http://schemas.openxmlformats.org/drawingml/2006/picture">
+                  <pic:nvPicPr>
+                    <pic:cNvPr id="1" name=""/>
+                    <pic:cNvPicPr/>
+                  </pic:nvPicPr>
+                  <pic:blipFill>
+                    <a:blip r:embed="rId15"/>
+                    <a:stretch>
+                      <a:fillRect/>
+                    </a:stretch>
+                  </pic:blipFill>
+                  <pic:spPr>
+                    <a:xfrm>
+                      <a:off x="0" y="0"/>
+                      <a:ext cx="8272086" cy="456391"/>
+                    </a:xfrm>
+                    <a:prstGeom prst="rect">
+                      <a:avLst/>
+                    </a:prstGeom>
+                  </pic:spPr>
+                </pic:pic>
+              </a:graphicData>
+            </a:graphic>
+          </wp:inline>
+        </w:drawing>
+      </w:r>
+    </w:p>
+    <w:p>
+      <w:pPr>
+        <w:pStyle w:val="PargrafodaLista"/>
+        <w:tabs>
+          <w:tab w:val="left" w:pos="1275"/>
+        </w:tabs>
+        <w:rPr>
+          <w:sz w:val="24"/>
+          <w:szCs w:val="24"/>
+        </w:rPr>
+      </w:pPr>
+      <w:r>
+        <w:rPr>
+          <w:sz w:val="24"/>
+          <w:szCs w:val="24"/>
+        </w:rPr>
+        <w:drawing>
+          <wp:inline distT="0" distB="0" distL="0" distR="0" wp14:anchorId="43BB52EF" wp14:editId="59BC5150">
+            <wp:extent cx="1848108" cy="800212"/>
+            <wp:effectExtent l="0" t="0" r="0" b="0"/>
+            <wp:docPr id="12" name="Imagem 12"/>
+            <wp:cNvGraphicFramePr>
+              <a:graphicFrameLocks xmlns:a="http://schemas.openxmlformats.org/drawingml/2006/main" noChangeAspect="1"/>
+            </wp:cNvGraphicFramePr>
+            <a:graphic xmlns:a="http://schemas.openxmlformats.org/drawingml/2006/main">
+              <a:graphicData uri="http://schemas.openxmlformats.org/drawingml/2006/picture">
+                <pic:pic xmlns:pic="http://schemas.openxmlformats.org/drawingml/2006/picture">
+                  <pic:nvPicPr>
+                    <pic:cNvPr id="1" name=""/>
+                    <pic:cNvPicPr/>
+                  </pic:nvPicPr>
+                  <pic:blipFill>
+                    <a:blip r:embed="rId16"/>
+                    <a:stretch>
+                      <a:fillRect/>
+                    </a:stretch>
+                  </pic:blipFill>
+                  <pic:spPr>
+                    <a:xfrm>
+                      <a:off x="0" y="0"/>
+                      <a:ext cx="1848108" cy="800212"/>
+                    </a:xfrm>
+                    <a:prstGeom prst="rect">
+                      <a:avLst/>
+                    </a:prstGeom>
+                  </pic:spPr>
+                </pic:pic>
+              </a:graphicData>
+            </a:graphic>
+          </wp:inline>
+        </w:drawing>
+      </w:r>
+    </w:p>
+    <w:p>
+      <w:pPr>
+        <w:pStyle w:val="PargrafodaLista"/>
+        <w:tabs>
+          <w:tab w:val="left" w:pos="1275"/>
+        </w:tabs>
+        <w:rPr>
+          <w:sz w:val="24"/>
+          <w:szCs w:val="24"/>
+        </w:rPr>
+      </w:pPr>
+    </w:p>
+    <w:p>
+      <w:pPr>
+        <w:pStyle w:val="PargrafodaLista"/>
+        <w:tabs>
+          <w:tab w:val="left" w:pos="1275"/>
+        </w:tabs>
+        <w:rPr>
+          <w:sz w:val="24"/>
+          <w:szCs w:val="24"/>
+        </w:rPr>
+      </w:pPr>
+    </w:p>
+    <w:p>
+      <w:pPr>
+        <w:pStyle w:val="PargrafodaLista"/>
+        <w:tabs>
+          <w:tab w:val="left" w:pos="1275"/>
+        </w:tabs>
+        <w:rPr>
+          <w:sz w:val="24"/>
+          <w:szCs w:val="24"/>
+        </w:rPr>
+      </w:pPr>
+      <w:r>
+        <w:rPr>
+          <w:sz w:val="24"/>
+          <w:szCs w:val="24"/>
+        </w:rPr>
+        <w:t xml:space="preserve">8 </w:t>
+      </w:r>
+      <w:r>
+        <w:rPr>
+          <w:sz w:val="24"/>
+          <w:szCs w:val="24"/>
+        </w:rPr>
+        <w:t>–</w:t>
+      </w:r>
+      <w:r>
+        <w:rPr>
+          <w:sz w:val="24"/>
+          <w:szCs w:val="24"/>
+        </w:rPr>
+        <w:t xml:space="preserve"> </w:t>
+      </w:r>
+      <w:r>
+        <w:rPr>
+          <w:sz w:val="24"/>
+          <w:szCs w:val="24"/>
+        </w:rPr>
+        <w:t>Adicionamos ao site um subtítulo h2 e criamos uma lista não ordenada</w:t>
+      </w:r>
+    </w:p>
+    <w:p>
+      <w:pPr>
+        <w:pStyle w:val="PargrafodaLista"/>
+        <w:tabs>
+          <w:tab w:val="left" w:pos="1275"/>
+        </w:tabs>
+        <w:rPr>
+          <w:sz w:val="24"/>
+          <w:szCs w:val="24"/>
+        </w:rPr>
+      </w:pPr>
+    </w:p>
+    <w:p>
+      <w:pPr>
+        <w:pStyle w:val="PargrafodaLista"/>
+        <w:tabs>
+          <w:tab w:val="left" w:pos="1275"/>
+        </w:tabs>
+        <w:rPr>
+          <w:sz w:val="24"/>
+          <w:szCs w:val="24"/>
+        </w:rPr>
+      </w:pPr>
+      <w:r>
+        <w:rPr>
+          <w:sz w:val="24"/>
+          <w:szCs w:val="24"/>
+        </w:rPr>
+        <w:drawing>
+          <wp:inline distT="0" distB="0" distL="0" distR="0" wp14:anchorId="1CBBF734" wp14:editId="34135E47">
+            <wp:extent cx="5315692" cy="3057952"/>
+            <wp:effectExtent l="0" t="0" r="0" b="9525"/>
+            <wp:docPr id="13" name="Imagem 13"/>
+            <wp:cNvGraphicFramePr>
+              <a:graphicFrameLocks xmlns:a="http://schemas.openxmlformats.org/drawingml/2006/main" noChangeAspect="1"/>
+            </wp:cNvGraphicFramePr>
+            <a:graphic xmlns:a="http://schemas.openxmlformats.org/drawingml/2006/main">
+              <a:graphicData uri="http://schemas.openxmlformats.org/drawingml/2006/picture">
+                <pic:pic xmlns:pic="http://schemas.openxmlformats.org/drawingml/2006/picture">
+                  <pic:nvPicPr>
+                    <pic:cNvPr id="1" name=""/>
+                    <pic:cNvPicPr/>
+                  </pic:nvPicPr>
+                  <pic:blipFill>
+                    <a:blip r:embed="rId17"/>
+                    <a:stretch>
+                      <a:fillRect/>
+                    </a:stretch>
+                  </pic:blipFill>
+                  <pic:spPr>
+                    <a:xfrm>
+                      <a:off x="0" y="0"/>
+                      <a:ext cx="5315692" cy="3057952"/>
+                    </a:xfrm>
+                    <a:prstGeom prst="rect">
+                      <a:avLst/>
+                    </a:prstGeom>
+                  </pic:spPr>
+                </pic:pic>
+              </a:graphicData>
+            </a:graphic>
+          </wp:inline>
+        </w:drawing>
+      </w:r>
+    </w:p>
+    <w:p>
+      <w:pPr>
+        <w:pStyle w:val="PargrafodaLista"/>
+        <w:tabs>
+          <w:tab w:val="left" w:pos="1275"/>
+        </w:tabs>
+        <w:rPr>
+          <w:sz w:val="24"/>
+          <w:szCs w:val="24"/>
+        </w:rPr>
+      </w:pPr>
+    </w:p>
+    <w:p>
+      <w:pPr>
+        <w:pStyle w:val="PargrafodaLista"/>
+        <w:tabs>
+          <w:tab w:val="left" w:pos="1275"/>
+        </w:tabs>
+        <w:rPr>
+          <w:sz w:val="24"/>
+          <w:szCs w:val="24"/>
+        </w:rPr>
+      </w:pPr>
+      <w:r>
+        <w:rPr>
+          <w:sz w:val="24"/>
+          <w:szCs w:val="24"/>
+        </w:rPr>
+        <w:t xml:space="preserve">9 </w:t>
+      </w:r>
+      <w:r>
+        <w:rPr>
+          <w:sz w:val="24"/>
+          <w:szCs w:val="24"/>
+        </w:rPr>
+        <w:t>–</w:t>
+      </w:r>
+      <w:r>
+        <w:rPr>
+          <w:sz w:val="24"/>
+          <w:szCs w:val="24"/>
+        </w:rPr>
+        <w:t xml:space="preserve"> </w:t>
+      </w:r>
+      <w:r>
+        <w:rPr>
+          <w:sz w:val="24"/>
+          <w:szCs w:val="24"/>
+        </w:rPr>
+        <w:t xml:space="preserve">Na nossa lista não ordenada colocamos a mesma </w:t>
+      </w:r>
+      <w:proofErr w:type="spellStart"/>
+      <w:r>
+        <w:rPr>
+          <w:sz w:val="24"/>
+          <w:szCs w:val="24"/>
+        </w:rPr>
+        <w:t>class</w:t>
+      </w:r>
+      <w:proofErr w:type="spellEnd"/>
+      <w:r>
+        <w:rPr>
+          <w:sz w:val="24"/>
+          <w:szCs w:val="24"/>
+        </w:rPr>
+        <w:t xml:space="preserve"> para todos os itens para que assim </w:t>
+      </w:r>
+      <w:r>
+        <w:rPr>
+          <w:sz w:val="24"/>
+          <w:szCs w:val="24"/>
+        </w:rPr>
+        <w:t>os itens da lista possam</w:t>
+      </w:r>
+      <w:r>
+        <w:rPr>
+          <w:sz w:val="24"/>
+          <w:szCs w:val="24"/>
+        </w:rPr>
+        <w:t xml:space="preserve"> ter o mesmo comportamento ou seja de</w:t>
+      </w:r>
+      <w:r>
+        <w:rPr>
+          <w:sz w:val="24"/>
+          <w:szCs w:val="24"/>
+        </w:rPr>
+        <w:t>ixamos</w:t>
+      </w:r>
+      <w:r>
+        <w:rPr>
+          <w:sz w:val="24"/>
+          <w:szCs w:val="24"/>
+        </w:rPr>
+        <w:t xml:space="preserve"> todos em </w:t>
+      </w:r>
+      <w:proofErr w:type="spellStart"/>
+      <w:r>
+        <w:rPr>
+          <w:sz w:val="24"/>
+          <w:szCs w:val="24"/>
+        </w:rPr>
+        <w:t>italic</w:t>
+      </w:r>
+      <w:proofErr w:type="spellEnd"/>
+      <w:r>
+        <w:rPr>
+          <w:sz w:val="24"/>
+          <w:szCs w:val="24"/>
+        </w:rPr>
+        <w:t>.</w:t>
+      </w:r>
+    </w:p>
+    <w:p>
+      <w:pPr>
+        <w:pStyle w:val="PargrafodaLista"/>
+        <w:tabs>
+          <w:tab w:val="left" w:pos="1275"/>
+        </w:tabs>
+        <w:rPr>
+          <w:sz w:val="24"/>
+          <w:szCs w:val="24"/>
+        </w:rPr>
+      </w:pPr>
+      <w:r>
+        <w:rPr>
+          <w:sz w:val="24"/>
+          <w:szCs w:val="24"/>
+        </w:rPr>
+        <w:drawing>
+          <wp:inline distT="0" distB="0" distL="0" distR="0" wp14:anchorId="3BFC3D55" wp14:editId="20A96559">
+            <wp:extent cx="6163535" cy="2152950"/>
+            <wp:effectExtent l="0" t="0" r="8890" b="0"/>
+            <wp:docPr id="14" name="Imagem 14"/>
+            <wp:cNvGraphicFramePr>
+              <a:graphicFrameLocks xmlns:a="http://schemas.openxmlformats.org/drawingml/2006/main" noChangeAspect="1"/>
+            </wp:cNvGraphicFramePr>
+            <a:graphic xmlns:a="http://schemas.openxmlformats.org/drawingml/2006/main">
+              <a:graphicData uri="http://schemas.openxmlformats.org/drawingml/2006/picture">
+                <pic:pic xmlns:pic="http://schemas.openxmlformats.org/drawingml/2006/picture">
+                  <pic:nvPicPr>
+                    <pic:cNvPr id="1" name=""/>
+                    <pic:cNvPicPr/>
+                  </pic:nvPicPr>
+                  <pic:blipFill>
+                    <a:blip r:embed="rId18"/>
+                    <a:stretch>
+                      <a:fillRect/>
+                    </a:stretch>
+                  </pic:blipFill>
+                  <pic:spPr>
+                    <a:xfrm>
+                      <a:off x="0" y="0"/>
+                      <a:ext cx="6163535" cy="2152950"/>
+                    </a:xfrm>
+                    <a:prstGeom prst="rect">
+                      <a:avLst/>
+                    </a:prstGeom>
+                  </pic:spPr>
+                </pic:pic>
+              </a:graphicData>
+            </a:graphic>
+          </wp:inline>
+        </w:drawing>
+      </w:r>
+    </w:p>
+    <w:p>
+      <w:pPr>
+        <w:pStyle w:val="PargrafodaLista"/>
+        <w:tabs>
+          <w:tab w:val="left" w:pos="1275"/>
+        </w:tabs>
+        <w:rPr>
+          <w:sz w:val="24"/>
+          <w:szCs w:val="24"/>
+        </w:rPr>
+      </w:pPr>
+      <w:bookmarkStart w:id="0" w:name="_GoBack"/>
+      <w:r>
+        <w:rPr>
+          <w:sz w:val="24"/>
+          <w:szCs w:val="24"/>
+        </w:rPr>
+        <w:drawing>
+          <wp:inline distT="0" distB="0" distL="0" distR="0" wp14:anchorId="225E31E3" wp14:editId="12AC8611">
+            <wp:extent cx="3115110" cy="990738"/>
+            <wp:effectExtent l="0" t="0" r="9525" b="0"/>
+            <wp:docPr id="15" name="Imagem 15"/>
+            <wp:cNvGraphicFramePr>
+              <a:graphicFrameLocks xmlns:a="http://schemas.openxmlformats.org/drawingml/2006/main" noChangeAspect="1"/>
+            </wp:cNvGraphicFramePr>
+            <a:graphic xmlns:a="http://schemas.openxmlformats.org/drawingml/2006/main">
+              <a:graphicData uri="http://schemas.openxmlformats.org/drawingml/2006/picture">
+                <pic:pic xmlns:pic="http://schemas.openxmlformats.org/drawingml/2006/picture">
+                  <pic:nvPicPr>
+                    <pic:cNvPr id="1" name=""/>
+                    <pic:cNvPicPr/>
+                  </pic:nvPicPr>
+                  <pic:blipFill>
+                    <a:blip r:embed="rId19"/>
+                    <a:stretch>
+                      <a:fillRect/>
+                    </a:stretch>
+                  </pic:blipFill>
+                  <pic:spPr>
+                    <a:xfrm>
+                      <a:off x="0" y="0"/>
+                      <a:ext cx="3115110" cy="990738"/>
+                    </a:xfrm>
+                    <a:prstGeom prst="rect">
+                      <a:avLst/>
+                    </a:prstGeom>
+                  </pic:spPr>
+                </pic:pic>
+              </a:graphicData>
+            </a:graphic>
+          </wp:inline>
+        </w:drawing>
+      </w:r>
+      <w:bookmarkEnd w:id="0"/>
+    </w:p>
+    <w:p>
+      <w:pPr>
+        <w:pStyle w:val="PargrafodaLista"/>
+        <w:tabs>
+          <w:tab w:val="left" w:pos="1275"/>
+        </w:tabs>
+        <w:rPr>
+          <w:sz w:val="24"/>
+          <w:szCs w:val="24"/>
+        </w:rPr>
+      </w:pPr>
     </w:p>
     <w:sectPr>
       <w:pgSz w:w="11906" w:h="16838"/>

</xml_diff>

<commit_message>
atualização da aula do dia 31/08/2026
</commit_message>
<xml_diff>
--- a/apostila/Apostila Space For Men.docx
+++ b/apostila/Apostila Space For Men.docx
@@ -536,6 +536,7 @@
       </w:pPr>
       <w:r>
         <w:rPr>
+          <w:noProof/>
           <w:sz w:val="24"/>
           <w:szCs w:val="24"/>
         </w:rPr>
@@ -641,7 +642,23 @@
           <w:sz w:val="24"/>
           <w:szCs w:val="24"/>
         </w:rPr>
-        <w:t xml:space="preserve"> por referencia e utilizamos a regra </w:t>
+        <w:t xml:space="preserve"> por </w:t>
+      </w:r>
+      <w:proofErr w:type="spellStart"/>
+      <w:r>
+        <w:rPr>
+          <w:sz w:val="24"/>
+          <w:szCs w:val="24"/>
+        </w:rPr>
+        <w:t>referencia</w:t>
+      </w:r>
+      <w:proofErr w:type="spellEnd"/>
+      <w:r>
+        <w:rPr>
+          <w:sz w:val="24"/>
+          <w:szCs w:val="24"/>
+        </w:rPr>
+        <w:t xml:space="preserve"> e utilizamos a regra </w:t>
       </w:r>
       <w:r>
         <w:rPr>
@@ -680,6 +697,7 @@
       </w:pPr>
       <w:r>
         <w:rPr>
+          <w:noProof/>
           <w:sz w:val="24"/>
           <w:szCs w:val="24"/>
         </w:rPr>
@@ -733,6 +751,7 @@
       </w:pPr>
       <w:r>
         <w:rPr>
+          <w:noProof/>
           <w:sz w:val="24"/>
           <w:szCs w:val="24"/>
         </w:rPr>
@@ -812,6 +831,7 @@
       </w:r>
       <w:r>
         <w:rPr>
+          <w:noProof/>
           <w:sz w:val="24"/>
           <w:szCs w:val="24"/>
         </w:rPr>
@@ -927,6 +947,7 @@
       </w:pPr>
       <w:r>
         <w:rPr>
+          <w:noProof/>
           <w:sz w:val="24"/>
           <w:szCs w:val="24"/>
         </w:rPr>
@@ -980,6 +1001,7 @@
       </w:pPr>
       <w:r>
         <w:rPr>
+          <w:noProof/>
           <w:sz w:val="24"/>
           <w:szCs w:val="24"/>
         </w:rPr>
@@ -1064,6 +1086,7 @@
       </w:pPr>
       <w:r>
         <w:rPr>
+          <w:noProof/>
           <w:sz w:val="24"/>
           <w:szCs w:val="24"/>
         </w:rPr>
@@ -1171,6 +1194,7 @@
       </w:pPr>
       <w:r>
         <w:rPr>
+          <w:noProof/>
           <w:sz w:val="24"/>
           <w:szCs w:val="24"/>
         </w:rPr>
@@ -1224,6 +1248,7 @@
       </w:pPr>
       <w:r>
         <w:rPr>
+          <w:noProof/>
           <w:sz w:val="24"/>
           <w:szCs w:val="24"/>
         </w:rPr>
@@ -1353,6 +1378,7 @@
       </w:pPr>
       <w:r>
         <w:rPr>
+          <w:noProof/>
           <w:sz w:val="24"/>
           <w:szCs w:val="24"/>
         </w:rPr>
@@ -1518,6 +1544,7 @@
       </w:pPr>
       <w:r>
         <w:rPr>
+          <w:noProof/>
           <w:sz w:val="24"/>
           <w:szCs w:val="24"/>
         </w:rPr>
@@ -1569,9 +1596,9 @@
           <w:szCs w:val="24"/>
         </w:rPr>
       </w:pPr>
-      <w:bookmarkStart w:id="0" w:name="_GoBack"/>
-      <w:r>
-        <w:rPr>
+      <w:r>
+        <w:rPr>
+          <w:noProof/>
           <w:sz w:val="24"/>
           <w:szCs w:val="24"/>
         </w:rPr>
@@ -1611,6 +1638,1022 @@
           </wp:inline>
         </w:drawing>
       </w:r>
+    </w:p>
+    <w:p>
+      <w:pPr>
+        <w:pStyle w:val="PargrafodaLista"/>
+        <w:tabs>
+          <w:tab w:val="left" w:pos="1275"/>
+        </w:tabs>
+        <w:rPr>
+          <w:sz w:val="24"/>
+          <w:szCs w:val="24"/>
+        </w:rPr>
+      </w:pPr>
+    </w:p>
+    <w:p>
+      <w:pPr>
+        <w:pStyle w:val="PargrafodaLista"/>
+        <w:tabs>
+          <w:tab w:val="left" w:pos="1275"/>
+        </w:tabs>
+        <w:rPr>
+          <w:sz w:val="24"/>
+          <w:szCs w:val="24"/>
+        </w:rPr>
+      </w:pPr>
+      <w:r>
+        <w:rPr>
+          <w:noProof/>
+          <w:sz w:val="24"/>
+          <w:szCs w:val="24"/>
+        </w:rPr>
+        <mc:AlternateContent>
+          <mc:Choice Requires="wps">
+            <w:drawing>
+              <wp:anchor distT="0" distB="0" distL="114300" distR="114300" simplePos="0" relativeHeight="251660288" behindDoc="0" locked="0" layoutInCell="1" allowOverlap="1">
+                <wp:simplePos x="0" y="0"/>
+                <wp:positionH relativeFrom="column">
+                  <wp:posOffset>977790</wp:posOffset>
+                </wp:positionH>
+                <wp:positionV relativeFrom="paragraph">
+                  <wp:posOffset>206457</wp:posOffset>
+                </wp:positionV>
+                <wp:extent cx="1343770" cy="2663687"/>
+                <wp:effectExtent l="0" t="0" r="85090" b="60960"/>
+                <wp:wrapNone/>
+                <wp:docPr id="17" name="Conector de Seta Reta 17"/>
+                <wp:cNvGraphicFramePr/>
+                <a:graphic xmlns:a="http://schemas.openxmlformats.org/drawingml/2006/main">
+                  <a:graphicData uri="http://schemas.microsoft.com/office/word/2010/wordprocessingShape">
+                    <wps:wsp>
+                      <wps:cNvCnPr/>
+                      <wps:spPr>
+                        <a:xfrm>
+                          <a:off x="0" y="0"/>
+                          <a:ext cx="1343770" cy="2663687"/>
+                        </a:xfrm>
+                        <a:prstGeom prst="straightConnector1">
+                          <a:avLst/>
+                        </a:prstGeom>
+                        <a:ln>
+                          <a:tailEnd type="triangle"/>
+                        </a:ln>
+                      </wps:spPr>
+                      <wps:style>
+                        <a:lnRef idx="1">
+                          <a:schemeClr val="accent1"/>
+                        </a:lnRef>
+                        <a:fillRef idx="0">
+                          <a:schemeClr val="accent1"/>
+                        </a:fillRef>
+                        <a:effectRef idx="0">
+                          <a:schemeClr val="accent1"/>
+                        </a:effectRef>
+                        <a:fontRef idx="minor">
+                          <a:schemeClr val="tx1"/>
+                        </a:fontRef>
+                      </wps:style>
+                      <wps:bodyPr/>
+                    </wps:wsp>
+                  </a:graphicData>
+                </a:graphic>
+              </wp:anchor>
+            </w:drawing>
+          </mc:Choice>
+          <mc:Fallback>
+            <w:pict>
+              <v:shapetype w14:anchorId="0F5E566C" id="_x0000_t32" coordsize="21600,21600" o:spt="32" o:oned="t" path="m,l21600,21600e" filled="f">
+                <v:path arrowok="t" fillok="f" o:connecttype="none"/>
+                <o:lock v:ext="edit" shapetype="t"/>
+              </v:shapetype>
+              <v:shape id="Conector de Seta Reta 17" o:spid="_x0000_s1026" type="#_x0000_t32" style="position:absolute;margin-left:77pt;margin-top:16.25pt;width:105.8pt;height:209.75pt;z-index:251660288;visibility:visible;mso-wrap-style:square;mso-wrap-distance-left:9pt;mso-wrap-distance-top:0;mso-wrap-distance-right:9pt;mso-wrap-distance-bottom:0;mso-position-horizontal:absolute;mso-position-horizontal-relative:text;mso-position-vertical:absolute;mso-position-vertical-relative:text" o:gfxdata="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" strokecolor="#4472c4 [3204]" strokeweight=".5pt">
+                <v:stroke endarrow="block" joinstyle="miter"/>
+              </v:shape>
+            </w:pict>
+          </mc:Fallback>
+        </mc:AlternateContent>
+      </w:r>
+      <w:r>
+        <w:rPr>
+          <w:sz w:val="24"/>
+          <w:szCs w:val="24"/>
+        </w:rPr>
+        <w:t xml:space="preserve">10 </w:t>
+      </w:r>
+      <w:r>
+        <w:rPr>
+          <w:sz w:val="24"/>
+          <w:szCs w:val="24"/>
+        </w:rPr>
+        <w:t>–</w:t>
+      </w:r>
+      <w:r>
+        <w:rPr>
+          <w:sz w:val="24"/>
+          <w:szCs w:val="24"/>
+        </w:rPr>
+        <w:t xml:space="preserve"> </w:t>
+      </w:r>
+      <w:r>
+        <w:rPr>
+          <w:sz w:val="24"/>
+          <w:szCs w:val="24"/>
+        </w:rPr>
+        <w:t>Inserimos a imagem benefícios em nosso site utilizando o seguinte código:</w:t>
+      </w:r>
+    </w:p>
+    <w:p>
+      <w:pPr>
+        <w:pStyle w:val="PargrafodaLista"/>
+        <w:tabs>
+          <w:tab w:val="left" w:pos="1275"/>
+        </w:tabs>
+        <w:rPr>
+          <w:sz w:val="24"/>
+          <w:szCs w:val="24"/>
+        </w:rPr>
+      </w:pPr>
+      <w:r>
+        <w:rPr>
+          <w:sz w:val="24"/>
+          <w:szCs w:val="24"/>
+        </w:rPr>
+        <w:drawing>
+          <wp:inline distT="0" distB="0" distL="0" distR="0" wp14:anchorId="2D9DBB84" wp14:editId="14152CFA">
+            <wp:extent cx="8573696" cy="4096322"/>
+            <wp:effectExtent l="0" t="0" r="0" b="0"/>
+            <wp:docPr id="16" name="Imagem 16"/>
+            <wp:cNvGraphicFramePr>
+              <a:graphicFrameLocks xmlns:a="http://schemas.openxmlformats.org/drawingml/2006/main" noChangeAspect="1"/>
+            </wp:cNvGraphicFramePr>
+            <a:graphic xmlns:a="http://schemas.openxmlformats.org/drawingml/2006/main">
+              <a:graphicData uri="http://schemas.openxmlformats.org/drawingml/2006/picture">
+                <pic:pic xmlns:pic="http://schemas.openxmlformats.org/drawingml/2006/picture">
+                  <pic:nvPicPr>
+                    <pic:cNvPr id="1" name=""/>
+                    <pic:cNvPicPr/>
+                  </pic:nvPicPr>
+                  <pic:blipFill>
+                    <a:blip r:embed="rId20"/>
+                    <a:stretch>
+                      <a:fillRect/>
+                    </a:stretch>
+                  </pic:blipFill>
+                  <pic:spPr>
+                    <a:xfrm>
+                      <a:off x="0" y="0"/>
+                      <a:ext cx="8573696" cy="4096322"/>
+                    </a:xfrm>
+                    <a:prstGeom prst="rect">
+                      <a:avLst/>
+                    </a:prstGeom>
+                  </pic:spPr>
+                </pic:pic>
+              </a:graphicData>
+            </a:graphic>
+          </wp:inline>
+        </w:drawing>
+      </w:r>
+    </w:p>
+    <w:p>
+      <w:pPr>
+        <w:pStyle w:val="PargrafodaLista"/>
+        <w:tabs>
+          <w:tab w:val="left" w:pos="1275"/>
+        </w:tabs>
+        <w:rPr>
+          <w:sz w:val="24"/>
+          <w:szCs w:val="24"/>
+        </w:rPr>
+      </w:pPr>
+    </w:p>
+    <w:p>
+      <w:pPr>
+        <w:pStyle w:val="PargrafodaLista"/>
+        <w:tabs>
+          <w:tab w:val="left" w:pos="1275"/>
+        </w:tabs>
+        <w:rPr>
+          <w:sz w:val="24"/>
+          <w:szCs w:val="24"/>
+        </w:rPr>
+      </w:pPr>
+      <w:r>
+        <w:rPr>
+          <w:sz w:val="24"/>
+          <w:szCs w:val="24"/>
+        </w:rPr>
+        <w:t xml:space="preserve">11-    </w:t>
+      </w:r>
+      <w:r>
+        <w:rPr>
+          <w:sz w:val="24"/>
+          <w:szCs w:val="24"/>
+        </w:rPr>
+        <w:t xml:space="preserve">Para colocar a lista ao lado a imagem mudamos a natureza da lista utilizando display </w:t>
+      </w:r>
+      <w:proofErr w:type="spellStart"/>
+      <w:r>
+        <w:rPr>
+          <w:sz w:val="24"/>
+          <w:szCs w:val="24"/>
+        </w:rPr>
+        <w:t>inline-block</w:t>
+      </w:r>
+      <w:proofErr w:type="spellEnd"/>
+      <w:r>
+        <w:rPr>
+          <w:sz w:val="24"/>
+          <w:szCs w:val="24"/>
+        </w:rPr>
+        <w:t xml:space="preserve"> e para centraliza a lista no topo usamos o código vertical-</w:t>
+      </w:r>
+      <w:proofErr w:type="spellStart"/>
+      <w:r>
+        <w:rPr>
+          <w:sz w:val="24"/>
+          <w:szCs w:val="24"/>
+        </w:rPr>
+        <w:t>align</w:t>
+      </w:r>
+      <w:proofErr w:type="spellEnd"/>
+      <w:r>
+        <w:rPr>
+          <w:sz w:val="24"/>
+          <w:szCs w:val="24"/>
+        </w:rPr>
+        <w:t>: top</w:t>
+      </w:r>
+      <w:r>
+        <w:rPr>
+          <w:sz w:val="24"/>
+          <w:szCs w:val="24"/>
+        </w:rPr>
+        <w:t>.</w:t>
+      </w:r>
+    </w:p>
+    <w:p>
+      <w:pPr>
+        <w:pStyle w:val="PargrafodaLista"/>
+        <w:tabs>
+          <w:tab w:val="left" w:pos="1275"/>
+        </w:tabs>
+        <w:rPr>
+          <w:sz w:val="24"/>
+          <w:szCs w:val="24"/>
+        </w:rPr>
+      </w:pPr>
+    </w:p>
+    <w:p>
+      <w:pPr>
+        <w:pStyle w:val="PargrafodaLista"/>
+        <w:tabs>
+          <w:tab w:val="left" w:pos="1275"/>
+        </w:tabs>
+        <w:rPr>
+          <w:sz w:val="24"/>
+          <w:szCs w:val="24"/>
+        </w:rPr>
+      </w:pPr>
+      <w:r>
+        <w:rPr>
+          <w:sz w:val="24"/>
+          <w:szCs w:val="24"/>
+        </w:rPr>
+        <w:drawing>
+          <wp:inline distT="0" distB="0" distL="0" distR="0" wp14:anchorId="5AD2A16A" wp14:editId="49E6212A">
+            <wp:extent cx="1887026" cy="771519"/>
+            <wp:effectExtent l="0" t="0" r="0" b="0"/>
+            <wp:docPr id="18" name="Imagem 18"/>
+            <wp:cNvGraphicFramePr>
+              <a:graphicFrameLocks xmlns:a="http://schemas.openxmlformats.org/drawingml/2006/main" noChangeAspect="1"/>
+            </wp:cNvGraphicFramePr>
+            <a:graphic xmlns:a="http://schemas.openxmlformats.org/drawingml/2006/main">
+              <a:graphicData uri="http://schemas.openxmlformats.org/drawingml/2006/picture">
+                <pic:pic xmlns:pic="http://schemas.openxmlformats.org/drawingml/2006/picture">
+                  <pic:nvPicPr>
+                    <pic:cNvPr id="1" name=""/>
+                    <pic:cNvPicPr/>
+                  </pic:nvPicPr>
+                  <pic:blipFill>
+                    <a:blip r:embed="rId21"/>
+                    <a:stretch>
+                      <a:fillRect/>
+                    </a:stretch>
+                  </pic:blipFill>
+                  <pic:spPr>
+                    <a:xfrm>
+                      <a:off x="0" y="0"/>
+                      <a:ext cx="1945248" cy="795323"/>
+                    </a:xfrm>
+                    <a:prstGeom prst="rect">
+                      <a:avLst/>
+                    </a:prstGeom>
+                  </pic:spPr>
+                </pic:pic>
+              </a:graphicData>
+            </a:graphic>
+          </wp:inline>
+        </w:drawing>
+      </w:r>
+      <w:r>
+        <w:rPr>
+          <w:sz w:val="24"/>
+          <w:szCs w:val="24"/>
+        </w:rPr>
+        <w:drawing>
+          <wp:inline distT="0" distB="0" distL="0" distR="0" wp14:anchorId="25E113F8" wp14:editId="7BA425FD">
+            <wp:extent cx="4880941" cy="2705100"/>
+            <wp:effectExtent l="0" t="0" r="0" b="0"/>
+            <wp:docPr id="19" name="Imagem 19"/>
+            <wp:cNvGraphicFramePr>
+              <a:graphicFrameLocks xmlns:a="http://schemas.openxmlformats.org/drawingml/2006/main" noChangeAspect="1"/>
+            </wp:cNvGraphicFramePr>
+            <a:graphic xmlns:a="http://schemas.openxmlformats.org/drawingml/2006/main">
+              <a:graphicData uri="http://schemas.openxmlformats.org/drawingml/2006/picture">
+                <pic:pic xmlns:pic="http://schemas.openxmlformats.org/drawingml/2006/picture">
+                  <pic:nvPicPr>
+                    <pic:cNvPr id="1" name=""/>
+                    <pic:cNvPicPr/>
+                  </pic:nvPicPr>
+                  <pic:blipFill>
+                    <a:blip r:embed="rId22"/>
+                    <a:stretch>
+                      <a:fillRect/>
+                    </a:stretch>
+                  </pic:blipFill>
+                  <pic:spPr>
+                    <a:xfrm>
+                      <a:off x="0" y="0"/>
+                      <a:ext cx="4894005" cy="2712340"/>
+                    </a:xfrm>
+                    <a:prstGeom prst="rect">
+                      <a:avLst/>
+                    </a:prstGeom>
+                  </pic:spPr>
+                </pic:pic>
+              </a:graphicData>
+            </a:graphic>
+          </wp:inline>
+        </w:drawing>
+      </w:r>
+    </w:p>
+    <w:p>
+      <w:pPr>
+        <w:pStyle w:val="PargrafodaLista"/>
+        <w:tabs>
+          <w:tab w:val="left" w:pos="1275"/>
+        </w:tabs>
+        <w:rPr>
+          <w:sz w:val="24"/>
+          <w:szCs w:val="24"/>
+        </w:rPr>
+      </w:pPr>
+    </w:p>
+    <w:p>
+      <w:pPr>
+        <w:pStyle w:val="PargrafodaLista"/>
+        <w:tabs>
+          <w:tab w:val="left" w:pos="1275"/>
+        </w:tabs>
+        <w:rPr>
+          <w:sz w:val="24"/>
+          <w:szCs w:val="24"/>
+        </w:rPr>
+      </w:pPr>
+    </w:p>
+    <w:p>
+      <w:pPr>
+        <w:pStyle w:val="PargrafodaLista"/>
+        <w:tabs>
+          <w:tab w:val="left" w:pos="1275"/>
+        </w:tabs>
+        <w:rPr>
+          <w:sz w:val="24"/>
+          <w:szCs w:val="24"/>
+        </w:rPr>
+      </w:pPr>
+      <w:r>
+        <w:rPr>
+          <w:sz w:val="24"/>
+          <w:szCs w:val="24"/>
+        </w:rPr>
+        <w:t xml:space="preserve">12- </w:t>
+      </w:r>
+      <w:r>
+        <w:rPr>
+          <w:sz w:val="24"/>
+          <w:szCs w:val="24"/>
+        </w:rPr>
+        <w:t>Para colocar uma distancia entre a list</w:t>
+      </w:r>
+      <w:r>
+        <w:rPr>
+          <w:sz w:val="24"/>
+          <w:szCs w:val="24"/>
+        </w:rPr>
+        <w:t>a</w:t>
+      </w:r>
+      <w:r>
+        <w:rPr>
+          <w:sz w:val="24"/>
+          <w:szCs w:val="24"/>
+        </w:rPr>
+        <w:t xml:space="preserve"> e a imagem definimos um tamanho  (ela vai ocup</w:t>
+      </w:r>
+      <w:r>
+        <w:rPr>
+          <w:sz w:val="24"/>
+          <w:szCs w:val="24"/>
+        </w:rPr>
+        <w:t>ar</w:t>
+      </w:r>
+      <w:r>
+        <w:rPr>
+          <w:sz w:val="24"/>
+          <w:szCs w:val="24"/>
+        </w:rPr>
+        <w:t xml:space="preserve"> 20% de largura) e</w:t>
+      </w:r>
+      <w:r>
+        <w:rPr>
+          <w:sz w:val="24"/>
+          <w:szCs w:val="24"/>
+        </w:rPr>
+        <w:t xml:space="preserve"> um espaço externo de </w:t>
+      </w:r>
+      <w:r>
+        <w:rPr>
+          <w:sz w:val="24"/>
+          <w:szCs w:val="24"/>
+        </w:rPr>
+        <w:t xml:space="preserve"> </w:t>
+      </w:r>
+      <w:r>
+        <w:rPr>
+          <w:sz w:val="24"/>
+          <w:szCs w:val="24"/>
+        </w:rPr>
+        <w:t>15% do lado direito conforme imagem do código.</w:t>
+      </w:r>
+    </w:p>
+    <w:p>
+      <w:pPr>
+        <w:pStyle w:val="PargrafodaLista"/>
+        <w:tabs>
+          <w:tab w:val="left" w:pos="1275"/>
+        </w:tabs>
+        <w:rPr>
+          <w:sz w:val="24"/>
+          <w:szCs w:val="24"/>
+        </w:rPr>
+      </w:pPr>
+      <w:r>
+        <w:rPr>
+          <w:sz w:val="24"/>
+          <w:szCs w:val="24"/>
+        </w:rPr>
+        <w:drawing>
+          <wp:inline distT="0" distB="0" distL="0" distR="0" wp14:anchorId="0C38E37A" wp14:editId="1DE88312">
+            <wp:extent cx="4239217" cy="1933845"/>
+            <wp:effectExtent l="0" t="0" r="9525" b="9525"/>
+            <wp:docPr id="20" name="Imagem 20"/>
+            <wp:cNvGraphicFramePr>
+              <a:graphicFrameLocks xmlns:a="http://schemas.openxmlformats.org/drawingml/2006/main" noChangeAspect="1"/>
+            </wp:cNvGraphicFramePr>
+            <a:graphic xmlns:a="http://schemas.openxmlformats.org/drawingml/2006/main">
+              <a:graphicData uri="http://schemas.openxmlformats.org/drawingml/2006/picture">
+                <pic:pic xmlns:pic="http://schemas.openxmlformats.org/drawingml/2006/picture">
+                  <pic:nvPicPr>
+                    <pic:cNvPr id="1" name=""/>
+                    <pic:cNvPicPr/>
+                  </pic:nvPicPr>
+                  <pic:blipFill>
+                    <a:blip r:embed="rId23"/>
+                    <a:stretch>
+                      <a:fillRect/>
+                    </a:stretch>
+                  </pic:blipFill>
+                  <pic:spPr>
+                    <a:xfrm>
+                      <a:off x="0" y="0"/>
+                      <a:ext cx="4239217" cy="1933845"/>
+                    </a:xfrm>
+                    <a:prstGeom prst="rect">
+                      <a:avLst/>
+                    </a:prstGeom>
+                  </pic:spPr>
+                </pic:pic>
+              </a:graphicData>
+            </a:graphic>
+          </wp:inline>
+        </w:drawing>
+      </w:r>
+    </w:p>
+    <w:p>
+      <w:pPr>
+        <w:pStyle w:val="PargrafodaLista"/>
+        <w:tabs>
+          <w:tab w:val="left" w:pos="1275"/>
+        </w:tabs>
+        <w:rPr>
+          <w:sz w:val="24"/>
+          <w:szCs w:val="24"/>
+        </w:rPr>
+      </w:pPr>
+      <w:r>
+        <w:rPr>
+          <w:sz w:val="24"/>
+          <w:szCs w:val="24"/>
+        </w:rPr>
+        <w:drawing>
+          <wp:inline distT="0" distB="0" distL="0" distR="0" wp14:anchorId="43883715" wp14:editId="2A98B38E">
+            <wp:extent cx="5066876" cy="2155825"/>
+            <wp:effectExtent l="0" t="0" r="635" b="0"/>
+            <wp:docPr id="21" name="Imagem 21"/>
+            <wp:cNvGraphicFramePr>
+              <a:graphicFrameLocks xmlns:a="http://schemas.openxmlformats.org/drawingml/2006/main" noChangeAspect="1"/>
+            </wp:cNvGraphicFramePr>
+            <a:graphic xmlns:a="http://schemas.openxmlformats.org/drawingml/2006/main">
+              <a:graphicData uri="http://schemas.openxmlformats.org/drawingml/2006/picture">
+                <pic:pic xmlns:pic="http://schemas.openxmlformats.org/drawingml/2006/picture">
+                  <pic:nvPicPr>
+                    <pic:cNvPr id="1" name=""/>
+                    <pic:cNvPicPr/>
+                  </pic:nvPicPr>
+                  <pic:blipFill>
+                    <a:blip r:embed="rId24"/>
+                    <a:stretch>
+                      <a:fillRect/>
+                    </a:stretch>
+                  </pic:blipFill>
+                  <pic:spPr>
+                    <a:xfrm>
+                      <a:off x="0" y="0"/>
+                      <a:ext cx="5102872" cy="2171141"/>
+                    </a:xfrm>
+                    <a:prstGeom prst="rect">
+                      <a:avLst/>
+                    </a:prstGeom>
+                  </pic:spPr>
+                </pic:pic>
+              </a:graphicData>
+            </a:graphic>
+          </wp:inline>
+        </w:drawing>
+      </w:r>
+    </w:p>
+    <w:p>
+      <w:pPr>
+        <w:pStyle w:val="PargrafodaLista"/>
+        <w:tabs>
+          <w:tab w:val="left" w:pos="1275"/>
+        </w:tabs>
+        <w:rPr>
+          <w:sz w:val="24"/>
+          <w:szCs w:val="24"/>
+        </w:rPr>
+      </w:pPr>
+    </w:p>
+    <w:p>
+      <w:pPr>
+        <w:pStyle w:val="PargrafodaLista"/>
+        <w:tabs>
+          <w:tab w:val="left" w:pos="1275"/>
+        </w:tabs>
+        <w:rPr>
+          <w:sz w:val="24"/>
+          <w:szCs w:val="24"/>
+        </w:rPr>
+      </w:pPr>
+      <w:r>
+        <w:rPr>
+          <w:sz w:val="24"/>
+          <w:szCs w:val="24"/>
+        </w:rPr>
+        <w:t xml:space="preserve">13- </w:t>
+      </w:r>
+      <w:r>
+        <w:rPr>
+          <w:sz w:val="24"/>
+          <w:szCs w:val="24"/>
+        </w:rPr>
+        <w:t xml:space="preserve">Em nosso site criamos duas </w:t>
+      </w:r>
+      <w:proofErr w:type="spellStart"/>
+      <w:r>
+        <w:rPr>
+          <w:sz w:val="24"/>
+          <w:szCs w:val="24"/>
+        </w:rPr>
+        <w:t>div</w:t>
+      </w:r>
+      <w:proofErr w:type="spellEnd"/>
+      <w:r>
+        <w:rPr>
+          <w:sz w:val="24"/>
+          <w:szCs w:val="24"/>
+        </w:rPr>
+        <w:t xml:space="preserve"> uma para parte principal e a outra para parte dos benefícios.</w:t>
+      </w:r>
+    </w:p>
+    <w:p>
+      <w:pPr>
+        <w:pStyle w:val="PargrafodaLista"/>
+        <w:tabs>
+          <w:tab w:val="left" w:pos="1275"/>
+        </w:tabs>
+        <w:rPr>
+          <w:sz w:val="24"/>
+          <w:szCs w:val="24"/>
+        </w:rPr>
+      </w:pPr>
+    </w:p>
+    <w:p>
+      <w:pPr>
+        <w:pStyle w:val="PargrafodaLista"/>
+        <w:tabs>
+          <w:tab w:val="left" w:pos="1275"/>
+        </w:tabs>
+        <w:rPr>
+          <w:sz w:val="24"/>
+          <w:szCs w:val="24"/>
+        </w:rPr>
+      </w:pPr>
+      <w:r>
+        <w:rPr>
+          <w:sz w:val="24"/>
+          <w:szCs w:val="24"/>
+        </w:rPr>
+        <w:drawing>
+          <wp:inline distT="0" distB="0" distL="0" distR="0" wp14:anchorId="0E249081" wp14:editId="01CC254E">
+            <wp:extent cx="6344535" cy="5534797"/>
+            <wp:effectExtent l="0" t="0" r="0" b="8890"/>
+            <wp:docPr id="22" name="Imagem 22"/>
+            <wp:cNvGraphicFramePr>
+              <a:graphicFrameLocks xmlns:a="http://schemas.openxmlformats.org/drawingml/2006/main" noChangeAspect="1"/>
+            </wp:cNvGraphicFramePr>
+            <a:graphic xmlns:a="http://schemas.openxmlformats.org/drawingml/2006/main">
+              <a:graphicData uri="http://schemas.openxmlformats.org/drawingml/2006/picture">
+                <pic:pic xmlns:pic="http://schemas.openxmlformats.org/drawingml/2006/picture">
+                  <pic:nvPicPr>
+                    <pic:cNvPr id="1" name=""/>
+                    <pic:cNvPicPr/>
+                  </pic:nvPicPr>
+                  <pic:blipFill>
+                    <a:blip r:embed="rId25"/>
+                    <a:stretch>
+                      <a:fillRect/>
+                    </a:stretch>
+                  </pic:blipFill>
+                  <pic:spPr>
+                    <a:xfrm>
+                      <a:off x="0" y="0"/>
+                      <a:ext cx="6344535" cy="5534797"/>
+                    </a:xfrm>
+                    <a:prstGeom prst="rect">
+                      <a:avLst/>
+                    </a:prstGeom>
+                  </pic:spPr>
+                </pic:pic>
+              </a:graphicData>
+            </a:graphic>
+          </wp:inline>
+        </w:drawing>
+      </w:r>
+    </w:p>
+    <w:p>
+      <w:pPr>
+        <w:pStyle w:val="PargrafodaLista"/>
+        <w:tabs>
+          <w:tab w:val="left" w:pos="1275"/>
+        </w:tabs>
+        <w:rPr>
+          <w:sz w:val="24"/>
+          <w:szCs w:val="24"/>
+        </w:rPr>
+      </w:pPr>
+    </w:p>
+    <w:p>
+      <w:pPr>
+        <w:pStyle w:val="PargrafodaLista"/>
+        <w:tabs>
+          <w:tab w:val="left" w:pos="1275"/>
+        </w:tabs>
+        <w:rPr>
+          <w:sz w:val="24"/>
+          <w:szCs w:val="24"/>
+        </w:rPr>
+      </w:pPr>
+      <w:r>
+        <w:rPr>
+          <w:sz w:val="24"/>
+          <w:szCs w:val="24"/>
+        </w:rPr>
+        <w:t xml:space="preserve">14 – Na </w:t>
+      </w:r>
+      <w:proofErr w:type="spellStart"/>
+      <w:r>
+        <w:rPr>
+          <w:sz w:val="24"/>
+          <w:szCs w:val="24"/>
+        </w:rPr>
+        <w:t>div</w:t>
+      </w:r>
+      <w:proofErr w:type="spellEnd"/>
+      <w:r>
+        <w:rPr>
+          <w:sz w:val="24"/>
+          <w:szCs w:val="24"/>
+        </w:rPr>
+        <w:t xml:space="preserve"> principal colocamos um espaço interno para todos os lados e deixamos uma cor de fundo conforme imagem do código  a baixo </w:t>
+      </w:r>
+      <w:r>
+        <w:rPr>
+          <w:sz w:val="24"/>
+          <w:szCs w:val="24"/>
+        </w:rPr>
+        <w:t>.</w:t>
+      </w:r>
+    </w:p>
+    <w:p>
+      <w:pPr>
+        <w:pStyle w:val="PargrafodaLista"/>
+        <w:tabs>
+          <w:tab w:val="left" w:pos="1275"/>
+        </w:tabs>
+        <w:rPr>
+          <w:sz w:val="24"/>
+          <w:szCs w:val="24"/>
+        </w:rPr>
+      </w:pPr>
+      <w:r>
+        <w:rPr>
+          <w:sz w:val="24"/>
+          <w:szCs w:val="24"/>
+        </w:rPr>
+        <w:drawing>
+          <wp:inline distT="0" distB="0" distL="0" distR="0" wp14:anchorId="3443BFF9" wp14:editId="5F4CB6B5">
+            <wp:extent cx="4467849" cy="1533739"/>
+            <wp:effectExtent l="0" t="0" r="9525" b="9525"/>
+            <wp:docPr id="23" name="Imagem 23"/>
+            <wp:cNvGraphicFramePr>
+              <a:graphicFrameLocks xmlns:a="http://schemas.openxmlformats.org/drawingml/2006/main" noChangeAspect="1"/>
+            </wp:cNvGraphicFramePr>
+            <a:graphic xmlns:a="http://schemas.openxmlformats.org/drawingml/2006/main">
+              <a:graphicData uri="http://schemas.openxmlformats.org/drawingml/2006/picture">
+                <pic:pic xmlns:pic="http://schemas.openxmlformats.org/drawingml/2006/picture">
+                  <pic:nvPicPr>
+                    <pic:cNvPr id="1" name=""/>
+                    <pic:cNvPicPr/>
+                  </pic:nvPicPr>
+                  <pic:blipFill>
+                    <a:blip r:embed="rId26"/>
+                    <a:stretch>
+                      <a:fillRect/>
+                    </a:stretch>
+                  </pic:blipFill>
+                  <pic:spPr>
+                    <a:xfrm>
+                      <a:off x="0" y="0"/>
+                      <a:ext cx="4467849" cy="1533739"/>
+                    </a:xfrm>
+                    <a:prstGeom prst="rect">
+                      <a:avLst/>
+                    </a:prstGeom>
+                  </pic:spPr>
+                </pic:pic>
+              </a:graphicData>
+            </a:graphic>
+          </wp:inline>
+        </w:drawing>
+      </w:r>
+    </w:p>
+    <w:p>
+      <w:pPr>
+        <w:pStyle w:val="PargrafodaLista"/>
+        <w:tabs>
+          <w:tab w:val="left" w:pos="1275"/>
+        </w:tabs>
+        <w:rPr>
+          <w:sz w:val="24"/>
+          <w:szCs w:val="24"/>
+        </w:rPr>
+      </w:pPr>
+    </w:p>
+    <w:p>
+      <w:pPr>
+        <w:pStyle w:val="PargrafodaLista"/>
+        <w:tabs>
+          <w:tab w:val="left" w:pos="1275"/>
+        </w:tabs>
+        <w:rPr>
+          <w:sz w:val="24"/>
+          <w:szCs w:val="24"/>
+        </w:rPr>
+      </w:pPr>
+      <w:r>
+        <w:rPr>
+          <w:sz w:val="24"/>
+          <w:szCs w:val="24"/>
+        </w:rPr>
+        <w:t xml:space="preserve">15 – Na </w:t>
+      </w:r>
+      <w:proofErr w:type="spellStart"/>
+      <w:r>
+        <w:rPr>
+          <w:sz w:val="24"/>
+          <w:szCs w:val="24"/>
+        </w:rPr>
+        <w:t>div</w:t>
+      </w:r>
+      <w:proofErr w:type="spellEnd"/>
+      <w:r>
+        <w:rPr>
+          <w:sz w:val="24"/>
+          <w:szCs w:val="24"/>
+        </w:rPr>
+        <w:t xml:space="preserve"> benefícios colocamos um espaço interno de </w:t>
+      </w:r>
+      <w:r>
+        <w:rPr>
+          <w:sz w:val="24"/>
+          <w:szCs w:val="24"/>
+        </w:rPr>
+        <w:t>20px</w:t>
+      </w:r>
+    </w:p>
+    <w:p>
+      <w:pPr>
+        <w:pStyle w:val="PargrafodaLista"/>
+        <w:tabs>
+          <w:tab w:val="left" w:pos="1275"/>
+        </w:tabs>
+        <w:rPr>
+          <w:sz w:val="24"/>
+          <w:szCs w:val="24"/>
+        </w:rPr>
+      </w:pPr>
+      <w:r>
+        <w:rPr>
+          <w:sz w:val="24"/>
+          <w:szCs w:val="24"/>
+        </w:rPr>
+        <w:drawing>
+          <wp:inline distT="0" distB="0" distL="0" distR="0" wp14:anchorId="165A4C43" wp14:editId="3DCEF4FA">
+            <wp:extent cx="2915057" cy="1228896"/>
+            <wp:effectExtent l="0" t="0" r="0" b="0"/>
+            <wp:docPr id="24" name="Imagem 24"/>
+            <wp:cNvGraphicFramePr>
+              <a:graphicFrameLocks xmlns:a="http://schemas.openxmlformats.org/drawingml/2006/main" noChangeAspect="1"/>
+            </wp:cNvGraphicFramePr>
+            <a:graphic xmlns:a="http://schemas.openxmlformats.org/drawingml/2006/main">
+              <a:graphicData uri="http://schemas.openxmlformats.org/drawingml/2006/picture">
+                <pic:pic xmlns:pic="http://schemas.openxmlformats.org/drawingml/2006/picture">
+                  <pic:nvPicPr>
+                    <pic:cNvPr id="1" name=""/>
+                    <pic:cNvPicPr/>
+                  </pic:nvPicPr>
+                  <pic:blipFill>
+                    <a:blip r:embed="rId27"/>
+                    <a:stretch>
+                      <a:fillRect/>
+                    </a:stretch>
+                  </pic:blipFill>
+                  <pic:spPr>
+                    <a:xfrm>
+                      <a:off x="0" y="0"/>
+                      <a:ext cx="2915057" cy="1228896"/>
+                    </a:xfrm>
+                    <a:prstGeom prst="rect">
+                      <a:avLst/>
+                    </a:prstGeom>
+                  </pic:spPr>
+                </pic:pic>
+              </a:graphicData>
+            </a:graphic>
+          </wp:inline>
+        </w:drawing>
+      </w:r>
+    </w:p>
+    <w:p>
+      <w:pPr>
+        <w:pStyle w:val="PargrafodaLista"/>
+        <w:tabs>
+          <w:tab w:val="left" w:pos="1275"/>
+        </w:tabs>
+        <w:rPr>
+          <w:sz w:val="24"/>
+          <w:szCs w:val="24"/>
+        </w:rPr>
+      </w:pPr>
+    </w:p>
+    <w:p>
+      <w:pPr>
+        <w:pStyle w:val="PargrafodaLista"/>
+        <w:tabs>
+          <w:tab w:val="left" w:pos="1275"/>
+        </w:tabs>
+        <w:rPr>
+          <w:sz w:val="24"/>
+          <w:szCs w:val="24"/>
+        </w:rPr>
+      </w:pPr>
+      <w:r>
+        <w:rPr>
+          <w:sz w:val="24"/>
+          <w:szCs w:val="24"/>
+        </w:rPr>
+        <w:t xml:space="preserve">16- </w:t>
+      </w:r>
+      <w:r>
+        <w:rPr>
+          <w:sz w:val="24"/>
+          <w:szCs w:val="24"/>
+        </w:rPr>
+        <w:t>Centralizamos</w:t>
+      </w:r>
+      <w:r>
+        <w:rPr>
+          <w:sz w:val="24"/>
+          <w:szCs w:val="24"/>
+        </w:rPr>
+        <w:t xml:space="preserve"> o subtítulo </w:t>
+      </w:r>
+      <w:r>
+        <w:rPr>
+          <w:sz w:val="24"/>
+          <w:szCs w:val="24"/>
+        </w:rPr>
+        <w:t>h2</w:t>
+      </w:r>
+    </w:p>
+    <w:p>
+      <w:pPr>
+        <w:pStyle w:val="PargrafodaLista"/>
+        <w:tabs>
+          <w:tab w:val="left" w:pos="1275"/>
+        </w:tabs>
+        <w:rPr>
+          <w:sz w:val="24"/>
+          <w:szCs w:val="24"/>
+        </w:rPr>
+      </w:pPr>
+    </w:p>
+    <w:p>
+      <w:pPr>
+        <w:pStyle w:val="PargrafodaLista"/>
+        <w:tabs>
+          <w:tab w:val="left" w:pos="1275"/>
+        </w:tabs>
+        <w:rPr>
+          <w:sz w:val="24"/>
+          <w:szCs w:val="24"/>
+        </w:rPr>
+      </w:pPr>
+      <w:r>
+        <w:rPr>
+          <w:sz w:val="24"/>
+          <w:szCs w:val="24"/>
+        </w:rPr>
+        <w:drawing>
+          <wp:inline distT="0" distB="0" distL="0" distR="0" wp14:anchorId="2250A179" wp14:editId="36DB3B43">
+            <wp:extent cx="3801005" cy="1562318"/>
+            <wp:effectExtent l="0" t="0" r="9525" b="0"/>
+            <wp:docPr id="25" name="Imagem 25"/>
+            <wp:cNvGraphicFramePr>
+              <a:graphicFrameLocks xmlns:a="http://schemas.openxmlformats.org/drawingml/2006/main" noChangeAspect="1"/>
+            </wp:cNvGraphicFramePr>
+            <a:graphic xmlns:a="http://schemas.openxmlformats.org/drawingml/2006/main">
+              <a:graphicData uri="http://schemas.openxmlformats.org/drawingml/2006/picture">
+                <pic:pic xmlns:pic="http://schemas.openxmlformats.org/drawingml/2006/picture">
+                  <pic:nvPicPr>
+                    <pic:cNvPr id="1" name=""/>
+                    <pic:cNvPicPr/>
+                  </pic:nvPicPr>
+                  <pic:blipFill>
+                    <a:blip r:embed="rId28"/>
+                    <a:stretch>
+                      <a:fillRect/>
+                    </a:stretch>
+                  </pic:blipFill>
+                  <pic:spPr>
+                    <a:xfrm>
+                      <a:off x="0" y="0"/>
+                      <a:ext cx="3801005" cy="1562318"/>
+                    </a:xfrm>
+                    <a:prstGeom prst="rect">
+                      <a:avLst/>
+                    </a:prstGeom>
+                  </pic:spPr>
+                </pic:pic>
+              </a:graphicData>
+            </a:graphic>
+          </wp:inline>
+        </w:drawing>
+      </w:r>
+      <w:bookmarkStart w:id="0" w:name="_GoBack"/>
       <w:bookmarkEnd w:id="0"/>
     </w:p>
     <w:p>

</xml_diff>

<commit_message>
atualização da aula dia 01/09/2026
</commit_message>
<xml_diff>
--- a/apostila/Apostila Space For Men.docx
+++ b/apostila/Apostila Space For Men.docx
@@ -1723,7 +1723,7 @@
           </mc:Choice>
           <mc:Fallback>
             <w:pict>
-              <v:shapetype w14:anchorId="0F5E566C" id="_x0000_t32" coordsize="21600,21600" o:spt="32" o:oned="t" path="m,l21600,21600e" filled="f">
+              <v:shapetype w14:anchorId="192D8F2A" id="_x0000_t32" coordsize="21600,21600" o:spt="32" o:oned="t" path="m,l21600,21600e" filled="f">
                 <v:path arrowok="t" fillok="f" o:connecttype="none"/>
                 <o:lock v:ext="edit" shapetype="t"/>
               </v:shapetype>
@@ -1776,6 +1776,7 @@
       </w:pPr>
       <w:r>
         <w:rPr>
+          <w:noProof/>
           <w:sz w:val="24"/>
           <w:szCs w:val="24"/>
         </w:rPr>
@@ -1918,6 +1919,7 @@
       </w:pPr>
       <w:r>
         <w:rPr>
+          <w:noProof/>
           <w:sz w:val="24"/>
           <w:szCs w:val="24"/>
         </w:rPr>
@@ -1959,6 +1961,7 @@
       </w:r>
       <w:r>
         <w:rPr>
+          <w:noProof/>
           <w:sz w:val="24"/>
           <w:szCs w:val="24"/>
         </w:rPr>
@@ -2111,6 +2114,7 @@
       </w:pPr>
       <w:r>
         <w:rPr>
+          <w:noProof/>
           <w:sz w:val="24"/>
           <w:szCs w:val="24"/>
         </w:rPr>
@@ -2164,6 +2168,7 @@
       </w:pPr>
       <w:r>
         <w:rPr>
+          <w:noProof/>
           <w:sz w:val="24"/>
           <w:szCs w:val="24"/>
         </w:rPr>
@@ -2283,6 +2288,7 @@
       </w:pPr>
       <w:r>
         <w:rPr>
+          <w:noProof/>
           <w:sz w:val="24"/>
           <w:szCs w:val="24"/>
         </w:rPr>
@@ -2390,6 +2396,7 @@
       </w:pPr>
       <w:r>
         <w:rPr>
+          <w:noProof/>
           <w:sz w:val="24"/>
           <w:szCs w:val="24"/>
         </w:rPr>
@@ -2497,6 +2504,7 @@
       </w:pPr>
       <w:r>
         <w:rPr>
+          <w:noProof/>
           <w:sz w:val="24"/>
           <w:szCs w:val="24"/>
         </w:rPr>
@@ -2614,6 +2622,7 @@
       </w:pPr>
       <w:r>
         <w:rPr>
+          <w:noProof/>
           <w:sz w:val="24"/>
           <w:szCs w:val="24"/>
         </w:rPr>
@@ -2653,20 +2662,1268 @@
           </wp:inline>
         </w:drawing>
       </w:r>
+    </w:p>
+    <w:p>
+      <w:pPr>
+        <w:pStyle w:val="PargrafodaLista"/>
+        <w:tabs>
+          <w:tab w:val="left" w:pos="1275"/>
+        </w:tabs>
+        <w:rPr>
+          <w:sz w:val="24"/>
+          <w:szCs w:val="24"/>
+        </w:rPr>
+      </w:pPr>
+    </w:p>
+    <w:p>
+      <w:pPr>
+        <w:pStyle w:val="PargrafodaLista"/>
+        <w:tabs>
+          <w:tab w:val="left" w:pos="1275"/>
+        </w:tabs>
+        <w:rPr>
+          <w:sz w:val="24"/>
+          <w:szCs w:val="24"/>
+        </w:rPr>
+      </w:pPr>
+      <w:r>
+        <w:rPr>
+          <w:sz w:val="24"/>
+          <w:szCs w:val="24"/>
+        </w:rPr>
+        <w:t xml:space="preserve">17 </w:t>
+      </w:r>
+      <w:r>
+        <w:rPr>
+          <w:sz w:val="24"/>
+          <w:szCs w:val="24"/>
+        </w:rPr>
+        <w:t>–</w:t>
+      </w:r>
+      <w:r>
+        <w:rPr>
+          <w:sz w:val="24"/>
+          <w:szCs w:val="24"/>
+        </w:rPr>
+        <w:t xml:space="preserve"> </w:t>
+      </w:r>
+      <w:r>
+        <w:rPr>
+          <w:sz w:val="24"/>
+          <w:szCs w:val="24"/>
+        </w:rPr>
+        <w:t>Criamos os arquivos produtos.html e o produtos.css dentro da pasta do projeto.</w:t>
+      </w:r>
+    </w:p>
+    <w:p>
+      <w:pPr>
+        <w:pStyle w:val="PargrafodaLista"/>
+        <w:tabs>
+          <w:tab w:val="left" w:pos="1275"/>
+        </w:tabs>
+        <w:rPr>
+          <w:sz w:val="24"/>
+          <w:szCs w:val="24"/>
+        </w:rPr>
+      </w:pPr>
+      <w:r>
+        <w:rPr>
+          <w:noProof/>
+          <w:sz w:val="24"/>
+          <w:szCs w:val="24"/>
+        </w:rPr>
+        <w:drawing>
+          <wp:inline distT="0" distB="0" distL="0" distR="0" wp14:anchorId="449C3AD7" wp14:editId="02F88A99">
+            <wp:extent cx="2467319" cy="3343742"/>
+            <wp:effectExtent l="0" t="0" r="0" b="9525"/>
+            <wp:docPr id="26" name="Imagem 26"/>
+            <wp:cNvGraphicFramePr>
+              <a:graphicFrameLocks xmlns:a="http://schemas.openxmlformats.org/drawingml/2006/main" noChangeAspect="1"/>
+            </wp:cNvGraphicFramePr>
+            <a:graphic xmlns:a="http://schemas.openxmlformats.org/drawingml/2006/main">
+              <a:graphicData uri="http://schemas.openxmlformats.org/drawingml/2006/picture">
+                <pic:pic xmlns:pic="http://schemas.openxmlformats.org/drawingml/2006/picture">
+                  <pic:nvPicPr>
+                    <pic:cNvPr id="1" name=""/>
+                    <pic:cNvPicPr/>
+                  </pic:nvPicPr>
+                  <pic:blipFill>
+                    <a:blip r:embed="rId29"/>
+                    <a:stretch>
+                      <a:fillRect/>
+                    </a:stretch>
+                  </pic:blipFill>
+                  <pic:spPr>
+                    <a:xfrm>
+                      <a:off x="0" y="0"/>
+                      <a:ext cx="2467319" cy="3343742"/>
+                    </a:xfrm>
+                    <a:prstGeom prst="rect">
+                      <a:avLst/>
+                    </a:prstGeom>
+                  </pic:spPr>
+                </pic:pic>
+              </a:graphicData>
+            </a:graphic>
+          </wp:inline>
+        </w:drawing>
+      </w:r>
+    </w:p>
+    <w:p>
+      <w:pPr>
+        <w:pStyle w:val="PargrafodaLista"/>
+        <w:tabs>
+          <w:tab w:val="left" w:pos="1275"/>
+        </w:tabs>
+        <w:rPr>
+          <w:sz w:val="24"/>
+          <w:szCs w:val="24"/>
+        </w:rPr>
+      </w:pPr>
+    </w:p>
+    <w:p>
+      <w:pPr>
+        <w:pStyle w:val="PargrafodaLista"/>
+        <w:tabs>
+          <w:tab w:val="left" w:pos="1275"/>
+        </w:tabs>
+        <w:rPr>
+          <w:sz w:val="24"/>
+          <w:szCs w:val="24"/>
+        </w:rPr>
+      </w:pPr>
+      <w:r>
+        <w:rPr>
+          <w:sz w:val="24"/>
+          <w:szCs w:val="24"/>
+        </w:rPr>
+        <w:t xml:space="preserve">18- </w:t>
+      </w:r>
+      <w:r>
+        <w:rPr>
+          <w:sz w:val="24"/>
+          <w:szCs w:val="24"/>
+        </w:rPr>
+        <w:t xml:space="preserve">No Header inserimos a </w:t>
+      </w:r>
+      <w:proofErr w:type="spellStart"/>
+      <w:r>
+        <w:rPr>
+          <w:sz w:val="24"/>
+          <w:szCs w:val="24"/>
+        </w:rPr>
+        <w:t>tag</w:t>
+      </w:r>
+      <w:proofErr w:type="spellEnd"/>
+      <w:r>
+        <w:rPr>
+          <w:sz w:val="24"/>
+          <w:szCs w:val="24"/>
+        </w:rPr>
+        <w:t xml:space="preserve"> h1 com a imagem do logo e abaixo fizemos uma lista não ordenada </w:t>
+      </w:r>
+      <w:r>
+        <w:rPr>
+          <w:sz w:val="24"/>
+          <w:szCs w:val="24"/>
+        </w:rPr>
+        <w:t xml:space="preserve">com os itens que posterior será o menu da pagina onde colocamos a </w:t>
+      </w:r>
+      <w:proofErr w:type="spellStart"/>
+      <w:r>
+        <w:rPr>
+          <w:sz w:val="24"/>
+          <w:szCs w:val="24"/>
+        </w:rPr>
+        <w:t>tag</w:t>
+      </w:r>
+      <w:proofErr w:type="spellEnd"/>
+      <w:r>
+        <w:rPr>
+          <w:sz w:val="24"/>
+          <w:szCs w:val="24"/>
+        </w:rPr>
+        <w:t xml:space="preserve">  </w:t>
+      </w:r>
+      <w:r>
+        <w:rPr>
+          <w:b/>
+          <w:sz w:val="24"/>
+          <w:szCs w:val="24"/>
+        </w:rPr>
+        <w:t>a</w:t>
+      </w:r>
+      <w:r>
+        <w:rPr>
+          <w:sz w:val="24"/>
+          <w:szCs w:val="24"/>
+        </w:rPr>
+        <w:t xml:space="preserve"> ancora para link com as paginas do projeto conforme imagem.</w:t>
+      </w:r>
+    </w:p>
+    <w:p>
+      <w:pPr>
+        <w:pStyle w:val="PargrafodaLista"/>
+        <w:tabs>
+          <w:tab w:val="left" w:pos="1275"/>
+        </w:tabs>
+        <w:rPr>
+          <w:sz w:val="24"/>
+          <w:szCs w:val="24"/>
+        </w:rPr>
+      </w:pPr>
+    </w:p>
+    <w:p>
+      <w:pPr>
+        <w:pStyle w:val="PargrafodaLista"/>
+        <w:tabs>
+          <w:tab w:val="left" w:pos="1275"/>
+        </w:tabs>
+        <w:rPr>
+          <w:sz w:val="24"/>
+          <w:szCs w:val="24"/>
+        </w:rPr>
+      </w:pPr>
+      <w:r>
+        <w:rPr>
+          <w:sz w:val="24"/>
+          <w:szCs w:val="24"/>
+        </w:rPr>
+        <w:drawing>
+          <wp:inline distT="0" distB="0" distL="0" distR="0" wp14:anchorId="498233E3" wp14:editId="136F54AF">
+            <wp:extent cx="6792273" cy="2353003"/>
+            <wp:effectExtent l="0" t="0" r="8890" b="9525"/>
+            <wp:docPr id="27" name="Imagem 27"/>
+            <wp:cNvGraphicFramePr>
+              <a:graphicFrameLocks xmlns:a="http://schemas.openxmlformats.org/drawingml/2006/main" noChangeAspect="1"/>
+            </wp:cNvGraphicFramePr>
+            <a:graphic xmlns:a="http://schemas.openxmlformats.org/drawingml/2006/main">
+              <a:graphicData uri="http://schemas.openxmlformats.org/drawingml/2006/picture">
+                <pic:pic xmlns:pic="http://schemas.openxmlformats.org/drawingml/2006/picture">
+                  <pic:nvPicPr>
+                    <pic:cNvPr id="1" name=""/>
+                    <pic:cNvPicPr/>
+                  </pic:nvPicPr>
+                  <pic:blipFill>
+                    <a:blip r:embed="rId30"/>
+                    <a:stretch>
+                      <a:fillRect/>
+                    </a:stretch>
+                  </pic:blipFill>
+                  <pic:spPr>
+                    <a:xfrm>
+                      <a:off x="0" y="0"/>
+                      <a:ext cx="6792273" cy="2353003"/>
+                    </a:xfrm>
+                    <a:prstGeom prst="rect">
+                      <a:avLst/>
+                    </a:prstGeom>
+                  </pic:spPr>
+                </pic:pic>
+              </a:graphicData>
+            </a:graphic>
+          </wp:inline>
+        </w:drawing>
+      </w:r>
+    </w:p>
+    <w:p>
+      <w:pPr>
+        <w:pStyle w:val="PargrafodaLista"/>
+        <w:tabs>
+          <w:tab w:val="left" w:pos="1275"/>
+        </w:tabs>
+        <w:rPr>
+          <w:sz w:val="24"/>
+          <w:szCs w:val="24"/>
+        </w:rPr>
+      </w:pPr>
+    </w:p>
+    <w:p>
+      <w:pPr>
+        <w:pStyle w:val="PargrafodaLista"/>
+        <w:tabs>
+          <w:tab w:val="left" w:pos="1275"/>
+        </w:tabs>
+        <w:rPr>
+          <w:sz w:val="24"/>
+          <w:szCs w:val="24"/>
+        </w:rPr>
+      </w:pPr>
+      <w:r>
+        <w:rPr>
+          <w:sz w:val="24"/>
+          <w:szCs w:val="24"/>
+        </w:rPr>
+        <w:t xml:space="preserve">19- No header colocamos uma cor de fundo </w:t>
+      </w:r>
+    </w:p>
+    <w:p>
+      <w:pPr>
+        <w:pStyle w:val="PargrafodaLista"/>
+        <w:tabs>
+          <w:tab w:val="left" w:pos="1275"/>
+        </w:tabs>
+        <w:rPr>
+          <w:sz w:val="24"/>
+          <w:szCs w:val="24"/>
+        </w:rPr>
+      </w:pPr>
+    </w:p>
+    <w:p>
+      <w:pPr>
+        <w:pStyle w:val="PargrafodaLista"/>
+        <w:tabs>
+          <w:tab w:val="left" w:pos="1275"/>
+        </w:tabs>
+        <w:rPr>
+          <w:sz w:val="24"/>
+          <w:szCs w:val="24"/>
+        </w:rPr>
+      </w:pPr>
+      <w:r>
+        <w:rPr>
+          <w:sz w:val="24"/>
+          <w:szCs w:val="24"/>
+        </w:rPr>
+        <w:drawing>
+          <wp:inline distT="0" distB="0" distL="0" distR="0" wp14:anchorId="50176E91" wp14:editId="584F669E">
+            <wp:extent cx="4963218" cy="2038635"/>
+            <wp:effectExtent l="0" t="0" r="0" b="0"/>
+            <wp:docPr id="28" name="Imagem 28"/>
+            <wp:cNvGraphicFramePr>
+              <a:graphicFrameLocks xmlns:a="http://schemas.openxmlformats.org/drawingml/2006/main" noChangeAspect="1"/>
+            </wp:cNvGraphicFramePr>
+            <a:graphic xmlns:a="http://schemas.openxmlformats.org/drawingml/2006/main">
+              <a:graphicData uri="http://schemas.openxmlformats.org/drawingml/2006/picture">
+                <pic:pic xmlns:pic="http://schemas.openxmlformats.org/drawingml/2006/picture">
+                  <pic:nvPicPr>
+                    <pic:cNvPr id="1" name=""/>
+                    <pic:cNvPicPr/>
+                  </pic:nvPicPr>
+                  <pic:blipFill>
+                    <a:blip r:embed="rId31"/>
+                    <a:stretch>
+                      <a:fillRect/>
+                    </a:stretch>
+                  </pic:blipFill>
+                  <pic:spPr>
+                    <a:xfrm>
+                      <a:off x="0" y="0"/>
+                      <a:ext cx="4963218" cy="2038635"/>
+                    </a:xfrm>
+                    <a:prstGeom prst="rect">
+                      <a:avLst/>
+                    </a:prstGeom>
+                  </pic:spPr>
+                </pic:pic>
+              </a:graphicData>
+            </a:graphic>
+          </wp:inline>
+        </w:drawing>
+      </w:r>
+    </w:p>
+    <w:p>
+      <w:pPr>
+        <w:pStyle w:val="PargrafodaLista"/>
+        <w:tabs>
+          <w:tab w:val="left" w:pos="1275"/>
+        </w:tabs>
+        <w:rPr>
+          <w:sz w:val="24"/>
+          <w:szCs w:val="24"/>
+        </w:rPr>
+      </w:pPr>
+    </w:p>
+    <w:p>
+      <w:pPr>
+        <w:pStyle w:val="PargrafodaLista"/>
+        <w:tabs>
+          <w:tab w:val="left" w:pos="1275"/>
+        </w:tabs>
+        <w:rPr>
+          <w:sz w:val="24"/>
+          <w:szCs w:val="24"/>
+        </w:rPr>
+      </w:pPr>
+    </w:p>
+    <w:p>
+      <w:pPr>
+        <w:pStyle w:val="PargrafodaLista"/>
+        <w:tabs>
+          <w:tab w:val="left" w:pos="1275"/>
+        </w:tabs>
+        <w:rPr>
+          <w:sz w:val="24"/>
+          <w:szCs w:val="24"/>
+        </w:rPr>
+      </w:pPr>
+      <w:r>
+        <w:rPr>
+          <w:noProof/>
+          <w:sz w:val="24"/>
+          <w:szCs w:val="24"/>
+        </w:rPr>
+        <mc:AlternateContent>
+          <mc:Choice Requires="wps">
+            <w:drawing>
+              <wp:anchor distT="0" distB="0" distL="114300" distR="114300" simplePos="0" relativeHeight="251661312" behindDoc="0" locked="0" layoutInCell="1" allowOverlap="1">
+                <wp:simplePos x="0" y="0"/>
+                <wp:positionH relativeFrom="column">
+                  <wp:posOffset>1411580</wp:posOffset>
+                </wp:positionH>
+                <wp:positionV relativeFrom="paragraph">
+                  <wp:posOffset>169037</wp:posOffset>
+                </wp:positionV>
+                <wp:extent cx="614476" cy="651053"/>
+                <wp:effectExtent l="38100" t="0" r="33655" b="53975"/>
+                <wp:wrapNone/>
+                <wp:docPr id="30" name="Conector de Seta Reta 30"/>
+                <wp:cNvGraphicFramePr/>
+                <a:graphic xmlns:a="http://schemas.openxmlformats.org/drawingml/2006/main">
+                  <a:graphicData uri="http://schemas.microsoft.com/office/word/2010/wordprocessingShape">
+                    <wps:wsp>
+                      <wps:cNvCnPr/>
+                      <wps:spPr>
+                        <a:xfrm flipH="1">
+                          <a:off x="0" y="0"/>
+                          <a:ext cx="614476" cy="651053"/>
+                        </a:xfrm>
+                        <a:prstGeom prst="straightConnector1">
+                          <a:avLst/>
+                        </a:prstGeom>
+                        <a:ln>
+                          <a:tailEnd type="triangle"/>
+                        </a:ln>
+                      </wps:spPr>
+                      <wps:style>
+                        <a:lnRef idx="1">
+                          <a:schemeClr val="accent1"/>
+                        </a:lnRef>
+                        <a:fillRef idx="0">
+                          <a:schemeClr val="accent1"/>
+                        </a:fillRef>
+                        <a:effectRef idx="0">
+                          <a:schemeClr val="accent1"/>
+                        </a:effectRef>
+                        <a:fontRef idx="minor">
+                          <a:schemeClr val="tx1"/>
+                        </a:fontRef>
+                      </wps:style>
+                      <wps:bodyPr/>
+                    </wps:wsp>
+                  </a:graphicData>
+                </a:graphic>
+              </wp:anchor>
+            </w:drawing>
+          </mc:Choice>
+          <mc:Fallback>
+            <w:pict>
+              <v:shapetype w14:anchorId="37C7CC5D" id="_x0000_t32" coordsize="21600,21600" o:spt="32" o:oned="t" path="m,l21600,21600e" filled="f">
+                <v:path arrowok="t" fillok="f" o:connecttype="none"/>
+                <o:lock v:ext="edit" shapetype="t"/>
+              </v:shapetype>
+              <v:shape id="Conector de Seta Reta 30" o:spid="_x0000_s1026" type="#_x0000_t32" style="position:absolute;margin-left:111.15pt;margin-top:13.3pt;width:48.4pt;height:51.25pt;flip:x;z-index:251661312;visibility:visible;mso-wrap-style:square;mso-wrap-distance-left:9pt;mso-wrap-distance-top:0;mso-wrap-distance-right:9pt;mso-wrap-distance-bottom:0;mso-position-horizontal:absolute;mso-position-horizontal-relative:text;mso-position-vertical:absolute;mso-position-vertical-relative:text" o:gfxdata="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" strokecolor="#4472c4 [3204]" strokeweight=".5pt">
+                <v:stroke endarrow="block" joinstyle="miter"/>
+              </v:shape>
+            </w:pict>
+          </mc:Fallback>
+        </mc:AlternateContent>
+      </w:r>
+      <w:r>
+        <w:rPr>
+          <w:sz w:val="24"/>
+          <w:szCs w:val="24"/>
+        </w:rPr>
+        <w:t>20 -</w:t>
+      </w:r>
+      <w:r>
+        <w:rPr>
+          <w:sz w:val="24"/>
+          <w:szCs w:val="24"/>
+        </w:rPr>
+        <w:t xml:space="preserve">Adicionamos a </w:t>
+      </w:r>
+      <w:proofErr w:type="spellStart"/>
+      <w:r>
+        <w:rPr>
+          <w:sz w:val="24"/>
+          <w:szCs w:val="24"/>
+        </w:rPr>
+        <w:t>tag</w:t>
+      </w:r>
+      <w:proofErr w:type="spellEnd"/>
+      <w:r>
+        <w:rPr>
+          <w:sz w:val="24"/>
+          <w:szCs w:val="24"/>
+        </w:rPr>
+        <w:t xml:space="preserve"> </w:t>
+      </w:r>
+      <w:proofErr w:type="spellStart"/>
+      <w:r>
+        <w:rPr>
+          <w:sz w:val="24"/>
+          <w:szCs w:val="24"/>
+        </w:rPr>
+        <w:t>nav</w:t>
+      </w:r>
+      <w:proofErr w:type="spellEnd"/>
+      <w:r>
+        <w:rPr>
+          <w:sz w:val="24"/>
+          <w:szCs w:val="24"/>
+        </w:rPr>
+        <w:t xml:space="preserve">  a nossa lista, indicando que é um menu de navegação</w:t>
+      </w:r>
+      <w:r>
+        <w:rPr>
+          <w:sz w:val="24"/>
+          <w:szCs w:val="24"/>
+        </w:rPr>
+        <w:t>.</w:t>
+      </w:r>
+      <w:r>
+        <w:rPr>
+          <w:sz w:val="24"/>
+          <w:szCs w:val="24"/>
+        </w:rPr>
+        <w:t xml:space="preserve"> </w:t>
+      </w:r>
+    </w:p>
+    <w:p>
+      <w:pPr>
+        <w:pStyle w:val="PargrafodaLista"/>
+        <w:tabs>
+          <w:tab w:val="left" w:pos="1275"/>
+        </w:tabs>
+        <w:rPr>
+          <w:sz w:val="24"/>
+          <w:szCs w:val="24"/>
+        </w:rPr>
+      </w:pPr>
+      <w:r>
+        <w:rPr>
+          <w:sz w:val="24"/>
+          <w:szCs w:val="24"/>
+        </w:rPr>
+        <w:drawing>
+          <wp:inline distT="0" distB="0" distL="0" distR="0" wp14:anchorId="43F408C2" wp14:editId="381D39B1">
+            <wp:extent cx="6382641" cy="2676899"/>
+            <wp:effectExtent l="0" t="0" r="0" b="9525"/>
+            <wp:docPr id="29" name="Imagem 29"/>
+            <wp:cNvGraphicFramePr>
+              <a:graphicFrameLocks xmlns:a="http://schemas.openxmlformats.org/drawingml/2006/main" noChangeAspect="1"/>
+            </wp:cNvGraphicFramePr>
+            <a:graphic xmlns:a="http://schemas.openxmlformats.org/drawingml/2006/main">
+              <a:graphicData uri="http://schemas.openxmlformats.org/drawingml/2006/picture">
+                <pic:pic xmlns:pic="http://schemas.openxmlformats.org/drawingml/2006/picture">
+                  <pic:nvPicPr>
+                    <pic:cNvPr id="1" name=""/>
+                    <pic:cNvPicPr/>
+                  </pic:nvPicPr>
+                  <pic:blipFill>
+                    <a:blip r:embed="rId32"/>
+                    <a:stretch>
+                      <a:fillRect/>
+                    </a:stretch>
+                  </pic:blipFill>
+                  <pic:spPr>
+                    <a:xfrm>
+                      <a:off x="0" y="0"/>
+                      <a:ext cx="6382641" cy="2676899"/>
+                    </a:xfrm>
+                    <a:prstGeom prst="rect">
+                      <a:avLst/>
+                    </a:prstGeom>
+                  </pic:spPr>
+                </pic:pic>
+              </a:graphicData>
+            </a:graphic>
+          </wp:inline>
+        </w:drawing>
+      </w:r>
+    </w:p>
+    <w:p>
+      <w:pPr>
+        <w:pStyle w:val="PargrafodaLista"/>
+        <w:tabs>
+          <w:tab w:val="left" w:pos="1275"/>
+        </w:tabs>
+        <w:rPr>
+          <w:sz w:val="24"/>
+          <w:szCs w:val="24"/>
+        </w:rPr>
+      </w:pPr>
+    </w:p>
+    <w:p>
+      <w:pPr>
+        <w:pStyle w:val="PargrafodaLista"/>
+        <w:tabs>
+          <w:tab w:val="left" w:pos="1275"/>
+        </w:tabs>
+        <w:rPr>
+          <w:sz w:val="24"/>
+          <w:szCs w:val="24"/>
+        </w:rPr>
+      </w:pPr>
+      <w:r>
+        <w:rPr>
+          <w:noProof/>
+          <w:sz w:val="24"/>
+          <w:szCs w:val="24"/>
+        </w:rPr>
+        <mc:AlternateContent>
+          <mc:Choice Requires="wps">
+            <w:drawing>
+              <wp:anchor distT="0" distB="0" distL="114300" distR="114300" simplePos="0" relativeHeight="251663360" behindDoc="0" locked="0" layoutInCell="1" allowOverlap="1">
+                <wp:simplePos x="0" y="0"/>
+                <wp:positionH relativeFrom="column">
+                  <wp:posOffset>3262325</wp:posOffset>
+                </wp:positionH>
+                <wp:positionV relativeFrom="paragraph">
+                  <wp:posOffset>188138</wp:posOffset>
+                </wp:positionV>
+                <wp:extent cx="3796589" cy="965606"/>
+                <wp:effectExtent l="38100" t="0" r="13970" b="82550"/>
+                <wp:wrapNone/>
+                <wp:docPr id="33" name="Conector de Seta Reta 33"/>
+                <wp:cNvGraphicFramePr/>
+                <a:graphic xmlns:a="http://schemas.openxmlformats.org/drawingml/2006/main">
+                  <a:graphicData uri="http://schemas.microsoft.com/office/word/2010/wordprocessingShape">
+                    <wps:wsp>
+                      <wps:cNvCnPr/>
+                      <wps:spPr>
+                        <a:xfrm flipH="1">
+                          <a:off x="0" y="0"/>
+                          <a:ext cx="3796589" cy="965606"/>
+                        </a:xfrm>
+                        <a:prstGeom prst="straightConnector1">
+                          <a:avLst/>
+                        </a:prstGeom>
+                        <a:ln>
+                          <a:tailEnd type="triangle"/>
+                        </a:ln>
+                      </wps:spPr>
+                      <wps:style>
+                        <a:lnRef idx="1">
+                          <a:schemeClr val="accent1"/>
+                        </a:lnRef>
+                        <a:fillRef idx="0">
+                          <a:schemeClr val="accent1"/>
+                        </a:fillRef>
+                        <a:effectRef idx="0">
+                          <a:schemeClr val="accent1"/>
+                        </a:effectRef>
+                        <a:fontRef idx="minor">
+                          <a:schemeClr val="tx1"/>
+                        </a:fontRef>
+                      </wps:style>
+                      <wps:bodyPr/>
+                    </wps:wsp>
+                  </a:graphicData>
+                </a:graphic>
+              </wp:anchor>
+            </w:drawing>
+          </mc:Choice>
+          <mc:Fallback>
+            <w:pict>
+              <v:shape w14:anchorId="6CF2AB6D" id="Conector de Seta Reta 33" o:spid="_x0000_s1026" type="#_x0000_t32" style="position:absolute;margin-left:256.9pt;margin-top:14.8pt;width:298.95pt;height:76.05pt;flip:x;z-index:251663360;visibility:visible;mso-wrap-style:square;mso-wrap-distance-left:9pt;mso-wrap-distance-top:0;mso-wrap-distance-right:9pt;mso-wrap-distance-bottom:0;mso-position-horizontal:absolute;mso-position-horizontal-relative:text;mso-position-vertical:absolute;mso-position-vertical-relative:text" o:gfxdata="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" strokecolor="#4472c4 [3204]" strokeweight=".5pt">
+                <v:stroke endarrow="block" joinstyle="miter"/>
+              </v:shape>
+            </w:pict>
+          </mc:Fallback>
+        </mc:AlternateContent>
+      </w:r>
+      <w:r>
+        <w:rPr>
+          <w:noProof/>
+          <w:sz w:val="24"/>
+          <w:szCs w:val="24"/>
+        </w:rPr>
+        <mc:AlternateContent>
+          <mc:Choice Requires="wps">
+            <w:drawing>
+              <wp:anchor distT="0" distB="0" distL="114300" distR="114300" simplePos="0" relativeHeight="251662336" behindDoc="0" locked="0" layoutInCell="1" allowOverlap="1">
+                <wp:simplePos x="0" y="0"/>
+                <wp:positionH relativeFrom="column">
+                  <wp:posOffset>2903880</wp:posOffset>
+                </wp:positionH>
+                <wp:positionV relativeFrom="paragraph">
+                  <wp:posOffset>180823</wp:posOffset>
+                </wp:positionV>
+                <wp:extent cx="1514247" cy="680313"/>
+                <wp:effectExtent l="38100" t="0" r="29210" b="62865"/>
+                <wp:wrapNone/>
+                <wp:docPr id="32" name="Conector de Seta Reta 32"/>
+                <wp:cNvGraphicFramePr/>
+                <a:graphic xmlns:a="http://schemas.openxmlformats.org/drawingml/2006/main">
+                  <a:graphicData uri="http://schemas.microsoft.com/office/word/2010/wordprocessingShape">
+                    <wps:wsp>
+                      <wps:cNvCnPr/>
+                      <wps:spPr>
+                        <a:xfrm flipH="1">
+                          <a:off x="0" y="0"/>
+                          <a:ext cx="1514247" cy="680313"/>
+                        </a:xfrm>
+                        <a:prstGeom prst="straightConnector1">
+                          <a:avLst/>
+                        </a:prstGeom>
+                        <a:ln>
+                          <a:tailEnd type="triangle"/>
+                        </a:ln>
+                      </wps:spPr>
+                      <wps:style>
+                        <a:lnRef idx="1">
+                          <a:schemeClr val="accent1"/>
+                        </a:lnRef>
+                        <a:fillRef idx="0">
+                          <a:schemeClr val="accent1"/>
+                        </a:fillRef>
+                        <a:effectRef idx="0">
+                          <a:schemeClr val="accent1"/>
+                        </a:effectRef>
+                        <a:fontRef idx="minor">
+                          <a:schemeClr val="tx1"/>
+                        </a:fontRef>
+                      </wps:style>
+                      <wps:bodyPr/>
+                    </wps:wsp>
+                  </a:graphicData>
+                </a:graphic>
+              </wp:anchor>
+            </w:drawing>
+          </mc:Choice>
+          <mc:Fallback>
+            <w:pict>
+              <v:shape w14:anchorId="65CBDF36" id="Conector de Seta Reta 32" o:spid="_x0000_s1026" type="#_x0000_t32" style="position:absolute;margin-left:228.65pt;margin-top:14.25pt;width:119.25pt;height:53.55pt;flip:x;z-index:251662336;visibility:visible;mso-wrap-style:square;mso-wrap-distance-left:9pt;mso-wrap-distance-top:0;mso-wrap-distance-right:9pt;mso-wrap-distance-bottom:0;mso-position-horizontal:absolute;mso-position-horizontal-relative:text;mso-position-vertical:absolute;mso-position-vertical-relative:text" o:gfxdata="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" strokecolor="#4472c4 [3204]" strokeweight=".5pt">
+                <v:stroke endarrow="block" joinstyle="miter"/>
+              </v:shape>
+            </w:pict>
+          </mc:Fallback>
+        </mc:AlternateContent>
+      </w:r>
+      <w:r>
+        <w:rPr>
+          <w:sz w:val="24"/>
+          <w:szCs w:val="24"/>
+        </w:rPr>
+        <w:t>21- N</w:t>
+      </w:r>
+      <w:r>
+        <w:rPr>
+          <w:sz w:val="24"/>
+          <w:szCs w:val="24"/>
+        </w:rPr>
+        <w:t xml:space="preserve">o </w:t>
+      </w:r>
+      <w:proofErr w:type="spellStart"/>
+      <w:r>
+        <w:rPr>
+          <w:sz w:val="24"/>
+          <w:szCs w:val="24"/>
+        </w:rPr>
+        <w:t>Css</w:t>
+      </w:r>
+      <w:proofErr w:type="spellEnd"/>
+      <w:r>
+        <w:rPr>
+          <w:sz w:val="24"/>
+          <w:szCs w:val="24"/>
+        </w:rPr>
+        <w:t xml:space="preserve"> utilizamos a </w:t>
+      </w:r>
+      <w:proofErr w:type="spellStart"/>
+      <w:r>
+        <w:rPr>
+          <w:sz w:val="24"/>
+          <w:szCs w:val="24"/>
+        </w:rPr>
+        <w:t>nav</w:t>
+      </w:r>
+      <w:proofErr w:type="spellEnd"/>
+      <w:r>
+        <w:rPr>
+          <w:sz w:val="24"/>
+          <w:szCs w:val="24"/>
+        </w:rPr>
+        <w:t xml:space="preserve"> li para colocar os itens um ao lado do outro</w:t>
+      </w:r>
+      <w:r>
+        <w:rPr>
+          <w:sz w:val="24"/>
+          <w:szCs w:val="24"/>
+        </w:rPr>
+        <w:t xml:space="preserve"> e </w:t>
+      </w:r>
+      <w:r>
+        <w:rPr>
+          <w:sz w:val="24"/>
+          <w:szCs w:val="24"/>
+        </w:rPr>
+        <w:t>colocamos</w:t>
+      </w:r>
+      <w:r>
+        <w:rPr>
+          <w:sz w:val="24"/>
+          <w:szCs w:val="24"/>
+        </w:rPr>
+        <w:t xml:space="preserve"> um espaço entre os itens. </w:t>
+      </w:r>
+    </w:p>
+    <w:p>
+      <w:pPr>
+        <w:pStyle w:val="PargrafodaLista"/>
+        <w:tabs>
+          <w:tab w:val="left" w:pos="1275"/>
+        </w:tabs>
+        <w:rPr>
+          <w:sz w:val="24"/>
+          <w:szCs w:val="24"/>
+        </w:rPr>
+      </w:pPr>
+      <w:r>
+        <w:rPr>
+          <w:sz w:val="24"/>
+          <w:szCs w:val="24"/>
+        </w:rPr>
+        <w:drawing>
+          <wp:inline distT="0" distB="0" distL="0" distR="0" wp14:anchorId="5D652032" wp14:editId="57A040D4">
+            <wp:extent cx="3505689" cy="1752845"/>
+            <wp:effectExtent l="0" t="0" r="0" b="0"/>
+            <wp:docPr id="31" name="Imagem 31"/>
+            <wp:cNvGraphicFramePr>
+              <a:graphicFrameLocks xmlns:a="http://schemas.openxmlformats.org/drawingml/2006/main" noChangeAspect="1"/>
+            </wp:cNvGraphicFramePr>
+            <a:graphic xmlns:a="http://schemas.openxmlformats.org/drawingml/2006/main">
+              <a:graphicData uri="http://schemas.openxmlformats.org/drawingml/2006/picture">
+                <pic:pic xmlns:pic="http://schemas.openxmlformats.org/drawingml/2006/picture">
+                  <pic:nvPicPr>
+                    <pic:cNvPr id="1" name=""/>
+                    <pic:cNvPicPr/>
+                  </pic:nvPicPr>
+                  <pic:blipFill>
+                    <a:blip r:embed="rId33"/>
+                    <a:stretch>
+                      <a:fillRect/>
+                    </a:stretch>
+                  </pic:blipFill>
+                  <pic:spPr>
+                    <a:xfrm>
+                      <a:off x="0" y="0"/>
+                      <a:ext cx="3505689" cy="1752845"/>
+                    </a:xfrm>
+                    <a:prstGeom prst="rect">
+                      <a:avLst/>
+                    </a:prstGeom>
+                  </pic:spPr>
+                </pic:pic>
+              </a:graphicData>
+            </a:graphic>
+          </wp:inline>
+        </w:drawing>
+      </w:r>
+    </w:p>
+    <w:p>
+      <w:pPr>
+        <w:pStyle w:val="PargrafodaLista"/>
+        <w:tabs>
+          <w:tab w:val="left" w:pos="1275"/>
+        </w:tabs>
+        <w:rPr>
+          <w:sz w:val="24"/>
+          <w:szCs w:val="24"/>
+        </w:rPr>
+      </w:pPr>
+    </w:p>
+    <w:p>
+      <w:pPr>
+        <w:pStyle w:val="PargrafodaLista"/>
+        <w:tabs>
+          <w:tab w:val="left" w:pos="1275"/>
+        </w:tabs>
+        <w:rPr>
+          <w:sz w:val="24"/>
+          <w:szCs w:val="24"/>
+        </w:rPr>
+      </w:pPr>
+      <w:r>
+        <w:rPr>
+          <w:sz w:val="24"/>
+          <w:szCs w:val="24"/>
+        </w:rPr>
+        <w:drawing>
+          <wp:inline distT="0" distB="0" distL="0" distR="0" wp14:anchorId="6CA1DEE4" wp14:editId="65572247">
+            <wp:extent cx="3905795" cy="2591162"/>
+            <wp:effectExtent l="0" t="0" r="0" b="0"/>
+            <wp:docPr id="34" name="Imagem 34"/>
+            <wp:cNvGraphicFramePr>
+              <a:graphicFrameLocks xmlns:a="http://schemas.openxmlformats.org/drawingml/2006/main" noChangeAspect="1"/>
+            </wp:cNvGraphicFramePr>
+            <a:graphic xmlns:a="http://schemas.openxmlformats.org/drawingml/2006/main">
+              <a:graphicData uri="http://schemas.openxmlformats.org/drawingml/2006/picture">
+                <pic:pic xmlns:pic="http://schemas.openxmlformats.org/drawingml/2006/picture">
+                  <pic:nvPicPr>
+                    <pic:cNvPr id="1" name=""/>
+                    <pic:cNvPicPr/>
+                  </pic:nvPicPr>
+                  <pic:blipFill>
+                    <a:blip r:embed="rId34"/>
+                    <a:stretch>
+                      <a:fillRect/>
+                    </a:stretch>
+                  </pic:blipFill>
+                  <pic:spPr>
+                    <a:xfrm>
+                      <a:off x="0" y="0"/>
+                      <a:ext cx="3905795" cy="2591162"/>
+                    </a:xfrm>
+                    <a:prstGeom prst="rect">
+                      <a:avLst/>
+                    </a:prstGeom>
+                  </pic:spPr>
+                </pic:pic>
+              </a:graphicData>
+            </a:graphic>
+          </wp:inline>
+        </w:drawing>
+      </w:r>
+    </w:p>
+    <w:p>
+      <w:pPr>
+        <w:pStyle w:val="PargrafodaLista"/>
+        <w:tabs>
+          <w:tab w:val="left" w:pos="1275"/>
+        </w:tabs>
+        <w:rPr>
+          <w:sz w:val="24"/>
+          <w:szCs w:val="24"/>
+        </w:rPr>
+      </w:pPr>
+    </w:p>
+    <w:p>
+      <w:pPr>
+        <w:pStyle w:val="PargrafodaLista"/>
+        <w:tabs>
+          <w:tab w:val="left" w:pos="1275"/>
+        </w:tabs>
+        <w:rPr>
+          <w:b/>
+          <w:sz w:val="24"/>
+          <w:szCs w:val="24"/>
+        </w:rPr>
+      </w:pPr>
+      <w:r>
+        <w:rPr>
+          <w:sz w:val="24"/>
+          <w:szCs w:val="24"/>
+        </w:rPr>
+        <w:t xml:space="preserve">22 – </w:t>
+      </w:r>
+      <w:r>
+        <w:rPr>
+          <w:sz w:val="24"/>
+          <w:szCs w:val="24"/>
+        </w:rPr>
+        <w:t xml:space="preserve">Ainda no </w:t>
+      </w:r>
+      <w:proofErr w:type="spellStart"/>
+      <w:r>
+        <w:rPr>
+          <w:sz w:val="24"/>
+          <w:szCs w:val="24"/>
+        </w:rPr>
+        <w:t>css</w:t>
+      </w:r>
+      <w:proofErr w:type="spellEnd"/>
+      <w:r>
+        <w:rPr>
+          <w:sz w:val="24"/>
+          <w:szCs w:val="24"/>
+        </w:rPr>
+        <w:t xml:space="preserve"> utilizando o </w:t>
+      </w:r>
+      <w:proofErr w:type="spellStart"/>
+      <w:r>
+        <w:rPr>
+          <w:b/>
+          <w:sz w:val="24"/>
+          <w:szCs w:val="24"/>
+        </w:rPr>
+        <w:t>nav</w:t>
+      </w:r>
+      <w:proofErr w:type="spellEnd"/>
+      <w:r>
+        <w:rPr>
+          <w:b/>
+          <w:sz w:val="24"/>
+          <w:szCs w:val="24"/>
+        </w:rPr>
+        <w:t xml:space="preserve"> a</w:t>
+      </w:r>
+      <w:r>
+        <w:rPr>
+          <w:b/>
+          <w:sz w:val="24"/>
+          <w:szCs w:val="24"/>
+        </w:rPr>
+        <w:t xml:space="preserve">  estilizamos os texto</w:t>
+      </w:r>
+      <w:r>
+        <w:rPr>
+          <w:b/>
+          <w:sz w:val="24"/>
+          <w:szCs w:val="24"/>
+        </w:rPr>
+        <w:t>s</w:t>
+      </w:r>
+      <w:r>
+        <w:rPr>
+          <w:b/>
+          <w:sz w:val="24"/>
+          <w:szCs w:val="24"/>
+        </w:rPr>
+        <w:t xml:space="preserve"> da seguinte forma:</w:t>
+      </w:r>
+    </w:p>
+    <w:p>
+      <w:pPr>
+        <w:pStyle w:val="PargrafodaLista"/>
+        <w:tabs>
+          <w:tab w:val="left" w:pos="1275"/>
+        </w:tabs>
+        <w:rPr>
+          <w:b/>
+          <w:sz w:val="24"/>
+          <w:szCs w:val="24"/>
+        </w:rPr>
+      </w:pPr>
+      <w:r>
+        <w:rPr>
+          <w:b/>
+          <w:sz w:val="24"/>
+          <w:szCs w:val="24"/>
+        </w:rPr>
+        <w:drawing>
+          <wp:anchor distT="0" distB="0" distL="114300" distR="114300" simplePos="0" relativeHeight="251664384" behindDoc="0" locked="0" layoutInCell="1" allowOverlap="1" wp14:anchorId="2BE5614F">
+            <wp:simplePos x="0" y="0"/>
+            <wp:positionH relativeFrom="column">
+              <wp:posOffset>4236085</wp:posOffset>
+            </wp:positionH>
+            <wp:positionV relativeFrom="paragraph">
+              <wp:posOffset>104140</wp:posOffset>
+            </wp:positionV>
+            <wp:extent cx="2160270" cy="1324610"/>
+            <wp:effectExtent l="0" t="0" r="0" b="8890"/>
+            <wp:wrapNone/>
+            <wp:docPr id="35" name="Imagem 35"/>
+            <wp:cNvGraphicFramePr>
+              <a:graphicFrameLocks xmlns:a="http://schemas.openxmlformats.org/drawingml/2006/main" noChangeAspect="1"/>
+            </wp:cNvGraphicFramePr>
+            <a:graphic xmlns:a="http://schemas.openxmlformats.org/drawingml/2006/main">
+              <a:graphicData uri="http://schemas.openxmlformats.org/drawingml/2006/picture">
+                <pic:pic xmlns:pic="http://schemas.openxmlformats.org/drawingml/2006/picture">
+                  <pic:nvPicPr>
+                    <pic:cNvPr id="1" name=""/>
+                    <pic:cNvPicPr/>
+                  </pic:nvPicPr>
+                  <pic:blipFill>
+                    <a:blip r:embed="rId35">
+                      <a:extLst>
+                        <a:ext uri="{28A0092B-C50C-407E-A947-70E740481C1C}">
+                          <a14:useLocalDpi xmlns:a14="http://schemas.microsoft.com/office/drawing/2010/main" val="0"/>
+                        </a:ext>
+                      </a:extLst>
+                    </a:blip>
+                    <a:stretch>
+                      <a:fillRect/>
+                    </a:stretch>
+                  </pic:blipFill>
+                  <pic:spPr>
+                    <a:xfrm>
+                      <a:off x="0" y="0"/>
+                      <a:ext cx="2160270" cy="1324610"/>
+                    </a:xfrm>
+                    <a:prstGeom prst="rect">
+                      <a:avLst/>
+                    </a:prstGeom>
+                  </pic:spPr>
+                </pic:pic>
+              </a:graphicData>
+            </a:graphic>
+          </wp:anchor>
+        </w:drawing>
+      </w:r>
+    </w:p>
+    <w:p>
+      <w:pPr>
+        <w:pStyle w:val="PargrafodaLista"/>
+        <w:numPr>
+          <w:ilvl w:val="0"/>
+          <w:numId w:val="2"/>
+        </w:numPr>
+        <w:tabs>
+          <w:tab w:val="left" w:pos="1275"/>
+        </w:tabs>
+        <w:rPr>
+          <w:b/>
+          <w:sz w:val="24"/>
+          <w:szCs w:val="24"/>
+        </w:rPr>
+      </w:pPr>
+      <w:r>
+        <w:rPr>
+          <w:b/>
+          <w:sz w:val="24"/>
+          <w:szCs w:val="24"/>
+        </w:rPr>
+        <w:t>Aumentamos o tamanho da fonte</w:t>
+      </w:r>
+    </w:p>
+    <w:p>
+      <w:pPr>
+        <w:pStyle w:val="PargrafodaLista"/>
+        <w:numPr>
+          <w:ilvl w:val="0"/>
+          <w:numId w:val="2"/>
+        </w:numPr>
+        <w:tabs>
+          <w:tab w:val="left" w:pos="1275"/>
+        </w:tabs>
+        <w:rPr>
+          <w:b/>
+          <w:sz w:val="24"/>
+          <w:szCs w:val="24"/>
+        </w:rPr>
+      </w:pPr>
+      <w:r>
+        <w:rPr>
+          <w:b/>
+          <w:sz w:val="24"/>
+          <w:szCs w:val="24"/>
+        </w:rPr>
+        <w:t xml:space="preserve">Deixamos a fonte em negrito e </w:t>
+      </w:r>
+      <w:r>
+        <w:rPr>
+          <w:b/>
+          <w:sz w:val="24"/>
+          <w:szCs w:val="24"/>
+        </w:rPr>
+        <w:t>encorpamos o texto.</w:t>
+      </w:r>
+      <w:r>
+        <w:rPr>
+          <w:b/>
+          <w:sz w:val="24"/>
+          <w:szCs w:val="24"/>
+        </w:rPr>
+        <w:t xml:space="preserve"> </w:t>
+      </w:r>
+    </w:p>
+    <w:p>
+      <w:pPr>
+        <w:pStyle w:val="PargrafodaLista"/>
+        <w:numPr>
+          <w:ilvl w:val="0"/>
+          <w:numId w:val="2"/>
+        </w:numPr>
+        <w:tabs>
+          <w:tab w:val="left" w:pos="1275"/>
+        </w:tabs>
+        <w:rPr>
+          <w:b/>
+          <w:sz w:val="24"/>
+          <w:szCs w:val="24"/>
+        </w:rPr>
+      </w:pPr>
+      <w:r>
+        <w:rPr>
+          <w:b/>
+          <w:sz w:val="24"/>
+          <w:szCs w:val="24"/>
+        </w:rPr>
+        <w:t xml:space="preserve">Transformamos o texto em </w:t>
+      </w:r>
+      <w:r>
+        <w:rPr>
+          <w:b/>
+          <w:sz w:val="24"/>
+          <w:szCs w:val="24"/>
+        </w:rPr>
+        <w:t>maiúsculo</w:t>
+      </w:r>
       <w:bookmarkStart w:id="0" w:name="_GoBack"/>
       <w:bookmarkEnd w:id="0"/>
     </w:p>
     <w:p>
       <w:pPr>
         <w:pStyle w:val="PargrafodaLista"/>
-        <w:tabs>
-          <w:tab w:val="left" w:pos="1275"/>
-        </w:tabs>
-        <w:rPr>
-          <w:sz w:val="24"/>
-          <w:szCs w:val="24"/>
-        </w:rPr>
-      </w:pPr>
+        <w:numPr>
+          <w:ilvl w:val="0"/>
+          <w:numId w:val="2"/>
+        </w:numPr>
+        <w:tabs>
+          <w:tab w:val="left" w:pos="1275"/>
+        </w:tabs>
+        <w:rPr>
+          <w:b/>
+          <w:sz w:val="24"/>
+          <w:szCs w:val="24"/>
+        </w:rPr>
+      </w:pPr>
+      <w:r>
+        <w:rPr>
+          <w:b/>
+          <w:sz w:val="24"/>
+          <w:szCs w:val="24"/>
+        </w:rPr>
+        <w:t>Colocamos a cor preta no texto</w:t>
+      </w:r>
+    </w:p>
+    <w:p>
+      <w:pPr>
+        <w:pStyle w:val="PargrafodaLista"/>
+        <w:numPr>
+          <w:ilvl w:val="0"/>
+          <w:numId w:val="2"/>
+        </w:numPr>
+        <w:tabs>
+          <w:tab w:val="left" w:pos="1275"/>
+        </w:tabs>
+        <w:rPr>
+          <w:b/>
+          <w:sz w:val="24"/>
+          <w:szCs w:val="24"/>
+        </w:rPr>
+      </w:pPr>
+      <w:r>
+        <w:rPr>
+          <w:b/>
+          <w:sz w:val="24"/>
+          <w:szCs w:val="24"/>
+        </w:rPr>
+        <w:t xml:space="preserve">Tiramos o sublinhado </w:t>
+      </w:r>
+    </w:p>
+    <w:p>
+      <w:pPr>
+        <w:pStyle w:val="PargrafodaLista"/>
+        <w:tabs>
+          <w:tab w:val="left" w:pos="1275"/>
+        </w:tabs>
+        <w:rPr>
+          <w:sz w:val="24"/>
+          <w:szCs w:val="24"/>
+        </w:rPr>
+      </w:pPr>
+      <w:r>
+        <w:rPr>
+          <w:b/>
+          <w:sz w:val="24"/>
+          <w:szCs w:val="24"/>
+        </w:rPr>
+        <w:br/>
+      </w:r>
     </w:p>
     <w:sectPr>
       <w:pgSz w:w="11906" w:h="16838"/>

</xml_diff>